<commit_message>
docs: update final OEP report team contributions
</commit_message>
<xml_diff>
--- a/notebooks/WasteWise_AI_Final_OEP_Report.docx
+++ b/notebooks/WasteWise_AI_Final_OEP_Report.docx
@@ -2,26 +2,11 @@
 <file path=word/document.xml><?xml version="1.0" encoding="utf-8"?>
 <w:document xmlns:wpc="http://schemas.microsoft.com/office/word/2010/wordprocessingCanvas" xmlns:cx="http://schemas.microsoft.com/office/drawing/2014/chartex" xmlns:cx1="http://schemas.microsoft.com/office/drawing/2015/9/8/chartex" xmlns:cx2="http://schemas.microsoft.com/office/drawing/2015/10/21/chartex" xmlns:cx3="http://schemas.microsoft.com/office/drawing/2016/5/9/chartex" xmlns:cx4="http://schemas.microsoft.com/office/drawing/2016/5/10/chartex" xmlns:cx5="http://schemas.microsoft.com/office/drawing/2016/5/11/chartex" xmlns:cx6="http://schemas.microsoft.com/office/drawing/2016/5/12/chartex" xmlns:cx7="http://schemas.microsoft.com/office/drawing/2016/5/13/chartex" xmlns:cx8="http://schemas.microsoft.com/office/drawing/2016/5/14/chartex" xmlns:mc="http://schemas.openxmlformats.org/markup-compatibility/2006" xmlns:aink="http://schemas.microsoft.com/office/drawing/2016/ink" xmlns:am3d="http://schemas.microsoft.com/office/drawing/2017/model3d" xmlns:o="urn:schemas-microsoft-com:office:office" xmlns:oel="http://schemas.microsoft.com/office/2019/extlst" xmlns:r="http://schemas.openxmlformats.org/officeDocument/2006/relationships" xmlns:m="http://schemas.openxmlformats.org/officeDocument/2006/math" xmlns:v="urn:schemas-microsoft-com:vml" xmlns:wp14="http://schemas.microsoft.com/office/word/2010/wordprocessingDrawing" xmlns:wp="http://schemas.openxmlformats.org/drawingml/2006/wordprocessingDrawing" xmlns:w10="urn:schemas-microsoft-com:office:word" xmlns:w="http://schemas.openxmlformats.org/wordprocessingml/2006/main" xmlns:w14="http://schemas.microsoft.com/office/word/2010/wordml" xmlns:w15="http://schemas.microsoft.com/office/word/2012/wordml" xmlns:w16cex="http://schemas.microsoft.com/office/word/2018/wordml/cex" xmlns:w16cid="http://schemas.microsoft.com/office/word/2016/wordml/cid" xmlns:w16="http://schemas.microsoft.com/office/word/2018/wordml" xmlns:w16du="http://schemas.microsoft.com/office/word/2023/wordml/word16du" xmlns:w16sdtdh="http://schemas.microsoft.com/office/word/2020/wordml/sdtdatahash" xmlns:w16sdtfl="http://schemas.microsoft.com/office/word/2024/wordml/sdtformatlock" xmlns:w16se="http://schemas.microsoft.com/office/word/2015/wordml/symex" xmlns:wpg="http://schemas.microsoft.com/office/word/2010/wordprocessingGroup" xmlns:wpi="http://schemas.microsoft.com/office/word/2010/wordprocessingInk" xmlns:wne="http://schemas.microsoft.com/office/word/2006/wordml" xmlns:wps="http://schemas.microsoft.com/office/word/2010/wordprocessingShape" mc:Ignorable="w14 w15 w16se w16cid w16 w16cex w16sdtdh w16sdtfl w16du wp14">
   <w:body>
+    <w:p/>
+    <w:p/>
     <w:p>
       <w:pPr>
-        <w:rPr>
-          <w:rFonts w:hint="eastAsia"/>
-        </w:rPr>
-      </w:pPr>
-    </w:p>
-    <w:p>
-      <w:pPr>
-        <w:rPr>
-          <w:rFonts w:hint="eastAsia"/>
-        </w:rPr>
-      </w:pPr>
-    </w:p>
-    <w:p>
-      <w:pPr>
         <w:jc w:val="center"/>
-        <w:rPr>
-          <w:rFonts w:hint="eastAsia"/>
-        </w:rPr>
       </w:pPr>
       <w:r>
         <w:rPr>
@@ -34,9 +19,6 @@
     <w:p>
       <w:pPr>
         <w:jc w:val="center"/>
-        <w:rPr>
-          <w:rFonts w:hint="eastAsia"/>
-        </w:rPr>
       </w:pPr>
       <w:r>
         <w:rPr>
@@ -46,19 +28,10 @@
         <w:t>Sarvajanik University, Surat</w:t>
       </w:r>
     </w:p>
+    <w:p/>
     <w:p>
       <w:pPr>
-        <w:rPr>
-          <w:rFonts w:hint="eastAsia"/>
-        </w:rPr>
-      </w:pPr>
-    </w:p>
-    <w:p>
-      <w:pPr>
         <w:jc w:val="center"/>
-        <w:rPr>
-          <w:rFonts w:hint="eastAsia"/>
-        </w:rPr>
       </w:pPr>
       <w:r>
         <w:rPr>
@@ -68,34 +41,31 @@
         <w:t>OPEN ENDED ASSIGNMENT IN ARTIFICIAL INTELLIGENCE</w:t>
       </w:r>
     </w:p>
+    <w:p/>
     <w:p>
       <w:pPr>
-        <w:rPr>
-          <w:rFonts w:hint="eastAsia"/>
-        </w:rPr>
-      </w:pPr>
-    </w:p>
-    <w:p>
-      <w:pPr>
         <w:jc w:val="center"/>
-        <w:rPr>
-          <w:rFonts w:hint="eastAsia"/>
-        </w:rPr>
-      </w:pPr>
+      </w:pPr>
+      <w:proofErr w:type="spellStart"/>
       <w:r>
         <w:rPr>
           <w:b/>
           <w:sz w:val="50"/>
         </w:rPr>
-        <w:t>WasteWise AI</w:t>
+        <w:t>WasteWise</w:t>
+      </w:r>
+      <w:proofErr w:type="spellEnd"/>
+      <w:r>
+        <w:rPr>
+          <w:b/>
+          <w:sz w:val="50"/>
+        </w:rPr>
+        <w:t xml:space="preserve"> AI</w:t>
       </w:r>
     </w:p>
     <w:p>
       <w:pPr>
         <w:jc w:val="center"/>
-        <w:rPr>
-          <w:rFonts w:hint="eastAsia"/>
-        </w:rPr>
       </w:pPr>
       <w:r>
         <w:rPr>
@@ -105,19 +75,10 @@
         <w:t>Intelligent Multi-Class Waste Detection and Classification Using Neural Networks</w:t>
       </w:r>
     </w:p>
+    <w:p/>
     <w:p>
       <w:pPr>
-        <w:rPr>
-          <w:rFonts w:hint="eastAsia"/>
-        </w:rPr>
-      </w:pPr>
-    </w:p>
-    <w:p>
-      <w:pPr>
         <w:jc w:val="center"/>
-        <w:rPr>
-          <w:rFonts w:hint="eastAsia"/>
-        </w:rPr>
       </w:pPr>
       <w:r>
         <w:rPr>
@@ -127,13 +88,7 @@
         <w:t>Computer Engineering Department</w:t>
       </w:r>
     </w:p>
-    <w:p>
-      <w:pPr>
-        <w:rPr>
-          <w:rFonts w:hint="eastAsia"/>
-        </w:rPr>
-      </w:pPr>
-    </w:p>
+    <w:p/>
     <w:tbl>
       <w:tblPr>
         <w:tblStyle w:val="TableGrid"/>
@@ -142,28 +97,33 @@
         <w:tblLook w:val="04A0" w:firstRow="1" w:lastRow="0" w:firstColumn="1" w:lastColumn="0" w:noHBand="0" w:noVBand="1"/>
       </w:tblPr>
       <w:tblGrid>
-        <w:gridCol w:w="5112"/>
-        <w:gridCol w:w="5112"/>
+        <w:gridCol w:w="5195"/>
+        <w:gridCol w:w="5195"/>
       </w:tblGrid>
       <w:tr>
         <w:trPr>
+          <w:trHeight w:val="339"/>
           <w:jc w:val="center"/>
         </w:trPr>
         <w:tc>
           <w:tcPr>
-            <w:tcW w:w="5112" w:type="dxa"/>
+            <w:tcW w:w="5195" w:type="dxa"/>
             <w:shd w:val="clear" w:color="auto" w:fill="D9EAF7"/>
             <w:vAlign w:val="center"/>
           </w:tcPr>
           <w:p>
             <w:pPr>
-              <w:rPr>
-                <w:rFonts w:hint="eastAsia"/>
+              <w:jc w:val="center"/>
+              <w:rPr>
+                <w:sz w:val="22"/>
+                <w:szCs w:val="28"/>
               </w:rPr>
             </w:pPr>
             <w:r>
               <w:rPr>
                 <w:b/>
+                <w:sz w:val="22"/>
+                <w:szCs w:val="28"/>
               </w:rPr>
               <w:t>Team Member</w:t>
             </w:r>
@@ -171,19 +131,23 @@
         </w:tc>
         <w:tc>
           <w:tcPr>
-            <w:tcW w:w="5112" w:type="dxa"/>
+            <w:tcW w:w="5195" w:type="dxa"/>
             <w:shd w:val="clear" w:color="auto" w:fill="D9EAF7"/>
             <w:vAlign w:val="center"/>
           </w:tcPr>
           <w:p>
             <w:pPr>
-              <w:rPr>
-                <w:rFonts w:hint="eastAsia"/>
+              <w:jc w:val="center"/>
+              <w:rPr>
+                <w:sz w:val="22"/>
+                <w:szCs w:val="28"/>
               </w:rPr>
             </w:pPr>
             <w:r>
               <w:rPr>
                 <w:b/>
+                <w:sz w:val="22"/>
+                <w:szCs w:val="28"/>
               </w:rPr>
               <w:t>Contribution</w:t>
             </w:r>
@@ -192,196 +156,268 @@
       </w:tr>
       <w:tr>
         <w:trPr>
+          <w:trHeight w:val="619"/>
           <w:jc w:val="center"/>
         </w:trPr>
         <w:tc>
           <w:tcPr>
-            <w:tcW w:w="5112" w:type="dxa"/>
+            <w:tcW w:w="5195" w:type="dxa"/>
             <w:vAlign w:val="center"/>
           </w:tcPr>
           <w:p>
             <w:pPr>
-              <w:rPr>
-                <w:rFonts w:hint="eastAsia"/>
+              <w:jc w:val="center"/>
+              <w:rPr>
+                <w:sz w:val="22"/>
+                <w:szCs w:val="28"/>
               </w:rPr>
             </w:pPr>
             <w:r>
+              <w:rPr>
+                <w:sz w:val="22"/>
+                <w:szCs w:val="28"/>
+              </w:rPr>
               <w:t>Drashtant Mevada</w:t>
             </w:r>
           </w:p>
         </w:tc>
         <w:tc>
           <w:tcPr>
-            <w:tcW w:w="5112" w:type="dxa"/>
+            <w:tcW w:w="5195" w:type="dxa"/>
             <w:vAlign w:val="center"/>
           </w:tcPr>
           <w:p>
             <w:pPr>
-              <w:rPr>
-                <w:rFonts w:hint="eastAsia"/>
+              <w:jc w:val="center"/>
+              <w:rPr>
+                <w:sz w:val="22"/>
+                <w:szCs w:val="28"/>
               </w:rPr>
             </w:pPr>
             <w:r>
-              <w:t>Project development, ML pipeline and integration</w:t>
-            </w:r>
-            <w:r>
-              <w:t>, Frontend, Model training.</w:t>
+              <w:rPr>
+                <w:sz w:val="22"/>
+                <w:szCs w:val="28"/>
+              </w:rPr>
+              <w:t>Project Development, AI/ML Pipeline, Model Training, Backend Integration &amp; System Architecture</w:t>
             </w:r>
           </w:p>
         </w:tc>
       </w:tr>
       <w:tr>
         <w:trPr>
+          <w:trHeight w:val="604"/>
           <w:jc w:val="center"/>
         </w:trPr>
         <w:tc>
           <w:tcPr>
-            <w:tcW w:w="5112" w:type="dxa"/>
+            <w:tcW w:w="5195" w:type="dxa"/>
             <w:vAlign w:val="center"/>
           </w:tcPr>
           <w:p>
             <w:pPr>
-              <w:rPr>
-                <w:rFonts w:hint="eastAsia"/>
+              <w:jc w:val="center"/>
+              <w:rPr>
+                <w:sz w:val="22"/>
+                <w:szCs w:val="28"/>
               </w:rPr>
             </w:pPr>
             <w:r>
+              <w:rPr>
+                <w:sz w:val="22"/>
+                <w:szCs w:val="28"/>
+              </w:rPr>
               <w:t>Smit Rathod</w:t>
             </w:r>
           </w:p>
         </w:tc>
         <w:tc>
           <w:tcPr>
-            <w:tcW w:w="5112" w:type="dxa"/>
+            <w:tcW w:w="5195" w:type="dxa"/>
             <w:vAlign w:val="center"/>
           </w:tcPr>
           <w:p>
             <w:pPr>
-              <w:rPr>
-                <w:rFonts w:hint="eastAsia"/>
+              <w:jc w:val="center"/>
+              <w:rPr>
+                <w:sz w:val="22"/>
+                <w:szCs w:val="28"/>
               </w:rPr>
             </w:pPr>
             <w:r>
-              <w:t>Team member</w:t>
+              <w:rPr>
+                <w:sz w:val="22"/>
+                <w:szCs w:val="28"/>
+              </w:rPr>
+              <w:t>OOD Detection, Semantic Compatibility, Reliability &amp; Model Evaluation</w:t>
             </w:r>
           </w:p>
         </w:tc>
       </w:tr>
       <w:tr>
         <w:trPr>
+          <w:trHeight w:val="619"/>
           <w:jc w:val="center"/>
         </w:trPr>
         <w:tc>
           <w:tcPr>
-            <w:tcW w:w="5112" w:type="dxa"/>
+            <w:tcW w:w="5195" w:type="dxa"/>
             <w:vAlign w:val="center"/>
           </w:tcPr>
           <w:p>
             <w:pPr>
-              <w:rPr>
-                <w:rFonts w:hint="eastAsia"/>
+              <w:jc w:val="center"/>
+              <w:rPr>
+                <w:sz w:val="22"/>
+                <w:szCs w:val="28"/>
               </w:rPr>
             </w:pPr>
             <w:r>
-              <w:t>Nirav Panwala</w:t>
+              <w:rPr>
+                <w:sz w:val="22"/>
+                <w:szCs w:val="28"/>
+              </w:rPr>
+              <w:t xml:space="preserve">Nirav </w:t>
             </w:r>
+            <w:proofErr w:type="spellStart"/>
+            <w:r>
+              <w:rPr>
+                <w:sz w:val="22"/>
+                <w:szCs w:val="28"/>
+              </w:rPr>
+              <w:t>Panwala</w:t>
+            </w:r>
+            <w:proofErr w:type="spellEnd"/>
           </w:p>
         </w:tc>
         <w:tc>
           <w:tcPr>
-            <w:tcW w:w="5112" w:type="dxa"/>
+            <w:tcW w:w="5195" w:type="dxa"/>
             <w:vAlign w:val="center"/>
           </w:tcPr>
           <w:p>
             <w:pPr>
-              <w:rPr>
-                <w:rFonts w:hint="eastAsia"/>
+              <w:jc w:val="center"/>
+              <w:rPr>
+                <w:sz w:val="22"/>
+                <w:szCs w:val="28"/>
               </w:rPr>
             </w:pPr>
             <w:r>
-              <w:t>Team member</w:t>
+              <w:rPr>
+                <w:sz w:val="22"/>
+                <w:szCs w:val="28"/>
+              </w:rPr>
+              <w:t>Dataset Collection, Data Engineering, Taxonomy, Annotation Validation &amp; Dataset Auditing</w:t>
             </w:r>
           </w:p>
         </w:tc>
       </w:tr>
       <w:tr>
         <w:trPr>
+          <w:trHeight w:val="604"/>
           <w:jc w:val="center"/>
         </w:trPr>
         <w:tc>
           <w:tcPr>
-            <w:tcW w:w="5112" w:type="dxa"/>
+            <w:tcW w:w="5195" w:type="dxa"/>
             <w:vAlign w:val="center"/>
           </w:tcPr>
           <w:p>
             <w:pPr>
-              <w:rPr>
-                <w:rFonts w:hint="eastAsia"/>
+              <w:jc w:val="center"/>
+              <w:rPr>
+                <w:sz w:val="22"/>
+                <w:szCs w:val="28"/>
               </w:rPr>
             </w:pPr>
             <w:r>
+              <w:rPr>
+                <w:sz w:val="22"/>
+                <w:szCs w:val="28"/>
+              </w:rPr>
               <w:t>Krish Tandel</w:t>
             </w:r>
           </w:p>
         </w:tc>
         <w:tc>
           <w:tcPr>
-            <w:tcW w:w="5112" w:type="dxa"/>
+            <w:tcW w:w="5195" w:type="dxa"/>
             <w:vAlign w:val="center"/>
           </w:tcPr>
           <w:p>
             <w:pPr>
-              <w:rPr>
-                <w:rFonts w:hint="eastAsia"/>
+              <w:jc w:val="center"/>
+              <w:rPr>
+                <w:sz w:val="22"/>
+                <w:szCs w:val="28"/>
               </w:rPr>
             </w:pPr>
             <w:r>
-              <w:t>Team member</w:t>
+              <w:rPr>
+                <w:sz w:val="22"/>
+                <w:szCs w:val="28"/>
+              </w:rPr>
+              <w:t>YOLO11s Object Detection, Detector Training, Evaluation &amp; Performance Analysis</w:t>
             </w:r>
           </w:p>
         </w:tc>
       </w:tr>
       <w:tr>
         <w:trPr>
+          <w:trHeight w:val="604"/>
           <w:jc w:val="center"/>
         </w:trPr>
         <w:tc>
           <w:tcPr>
-            <w:tcW w:w="5112" w:type="dxa"/>
+            <w:tcW w:w="5195" w:type="dxa"/>
             <w:vAlign w:val="center"/>
           </w:tcPr>
           <w:p>
+            <w:pPr>
+              <w:jc w:val="center"/>
+              <w:rPr>
+                <w:sz w:val="22"/>
+                <w:szCs w:val="28"/>
+              </w:rPr>
+            </w:pPr>
             <w:r>
+              <w:rPr>
+                <w:sz w:val="22"/>
+                <w:szCs w:val="28"/>
+              </w:rPr>
               <w:t>Ronak Solanki</w:t>
             </w:r>
           </w:p>
         </w:tc>
         <w:tc>
           <w:tcPr>
-            <w:tcW w:w="5112" w:type="dxa"/>
+            <w:tcW w:w="5195" w:type="dxa"/>
             <w:vAlign w:val="center"/>
           </w:tcPr>
           <w:p>
+            <w:pPr>
+              <w:jc w:val="center"/>
+              <w:rPr>
+                <w:sz w:val="22"/>
+                <w:szCs w:val="28"/>
+              </w:rPr>
+            </w:pPr>
             <w:r>
-              <w:t>Team member</w:t>
+              <w:rPr>
+                <w:sz w:val="22"/>
+                <w:szCs w:val="28"/>
+              </w:rPr>
+              <w:t>Frontend Development, UI/UX, Live Camera, API Integration &amp; Application Integration</w:t>
             </w:r>
           </w:p>
         </w:tc>
       </w:tr>
     </w:tbl>
+    <w:p/>
     <w:p>
       <w:pPr>
-        <w:rPr>
-          <w:rFonts w:hint="eastAsia"/>
-        </w:rPr>
-      </w:pPr>
-    </w:p>
-    <w:p>
-      <w:pPr>
         <w:jc w:val="center"/>
-        <w:rPr>
-          <w:rFonts w:hint="eastAsia"/>
-        </w:rPr>
       </w:pPr>
       <w:r>
         <w:rPr>
@@ -391,11 +427,6 @@
       </w:r>
     </w:p>
     <w:p>
-      <w:pPr>
-        <w:rPr>
-          <w:rFonts w:hint="eastAsia"/>
-        </w:rPr>
-      </w:pPr>
       <w:r>
         <w:br w:type="page"/>
       </w:r>
@@ -412,40 +443,117 @@
     <w:p>
       <w:pPr>
         <w:rPr>
-          <w:rFonts w:hint="eastAsia"/>
-        </w:rPr>
-      </w:pPr>
+          <w:sz w:val="20"/>
+          <w:szCs w:val="24"/>
+        </w:rPr>
+      </w:pPr>
+      <w:proofErr w:type="spellStart"/>
       <w:r>
-        <w:t>WasteWise AI is an AI-powered waste intelligence system designed to detect waste objects, classify them into practical and detailed waste categories, reject unsupported inputs, and provide disposal guidance. The production pipeline combines YOLO11s object detection with an ImageNet-pretrained ResNet50 classifier, an embedding-based out-of-distribution (OOD) detector, and a semantic compatibility gate.</w:t>
+        <w:rPr>
+          <w:sz w:val="20"/>
+          <w:szCs w:val="24"/>
+        </w:rPr>
+        <w:t>WasteWise</w:t>
+      </w:r>
+      <w:proofErr w:type="spellEnd"/>
+      <w:r>
+        <w:rPr>
+          <w:sz w:val="20"/>
+          <w:szCs w:val="24"/>
+        </w:rPr>
+        <w:t xml:space="preserve"> AI is an AI-powered waste intelligence system designed to detect waste objects, classify them into practical and detailed waste categories, reject unsupported inputs, and provide disposal guidance. The production pipeline combines YOLO11s object detection with an ImageNet-pretrained ResNet50 classifier, an embedding-based out-of-distribution (OOD) detector, and a semantic compatibility gate.</w:t>
       </w:r>
     </w:p>
     <w:p>
       <w:pPr>
         <w:rPr>
-          <w:rFonts w:hint="eastAsia"/>
+          <w:sz w:val="20"/>
+          <w:szCs w:val="24"/>
         </w:rPr>
       </w:pPr>
       <w:r>
-        <w:t>The detector uses six practical categories—plastic, glass, metal, paper_cardboard, biological, and other_trash—while the expanded ResNet50 classifier provides 19 detailed classes including medical-waste categories.</w:t>
+        <w:rPr>
+          <w:sz w:val="20"/>
+          <w:szCs w:val="24"/>
+        </w:rPr>
+        <w:t xml:space="preserve">The detector uses six practical categories—plastic, glass, metal, </w:t>
+      </w:r>
+      <w:proofErr w:type="spellStart"/>
+      <w:r>
+        <w:rPr>
+          <w:sz w:val="20"/>
+          <w:szCs w:val="24"/>
+        </w:rPr>
+        <w:t>paper_cardboard</w:t>
+      </w:r>
+      <w:proofErr w:type="spellEnd"/>
+      <w:r>
+        <w:rPr>
+          <w:sz w:val="20"/>
+          <w:szCs w:val="24"/>
+        </w:rPr>
+        <w:t xml:space="preserve">, biological, and </w:t>
+      </w:r>
+      <w:proofErr w:type="spellStart"/>
+      <w:r>
+        <w:rPr>
+          <w:sz w:val="20"/>
+          <w:szCs w:val="24"/>
+        </w:rPr>
+        <w:t>other_trash</w:t>
+      </w:r>
+      <w:proofErr w:type="spellEnd"/>
+      <w:r>
+        <w:rPr>
+          <w:sz w:val="20"/>
+          <w:szCs w:val="24"/>
+        </w:rPr>
+        <w:t>—while the expanded ResNet50 classifier provides 19 detailed classes including medical-waste categories.</w:t>
       </w:r>
     </w:p>
     <w:p>
       <w:pPr>
         <w:rPr>
-          <w:rFonts w:hint="eastAsia"/>
+          <w:sz w:val="20"/>
+          <w:szCs w:val="24"/>
         </w:rPr>
       </w:pPr>
       <w:r>
-        <w:t>The project includes dataset integrity and duplicate-audit tooling, controlled image preprocessing, staged model training, OOD threshold calibration, external evaluation, and a FastAPI inference service. On the supported subset of the Medical Waste 4.0 external dataset, the Expanded ResNet50 Stage 2 achieved 99.14% classification accuracy, with 6,195 correct predictions out of 6,249 supported images.</w:t>
+        <w:rPr>
+          <w:sz w:val="20"/>
+          <w:szCs w:val="24"/>
+        </w:rPr>
+        <w:t xml:space="preserve">The project includes dataset integrity and duplicate-audit tooling, controlled image preprocessing, staged model training, OOD threshold calibration, external evaluation, and a </w:t>
+      </w:r>
+      <w:proofErr w:type="spellStart"/>
+      <w:r>
+        <w:rPr>
+          <w:sz w:val="20"/>
+          <w:szCs w:val="24"/>
+        </w:rPr>
+        <w:t>FastAPI</w:t>
+      </w:r>
+      <w:proofErr w:type="spellEnd"/>
+      <w:r>
+        <w:rPr>
+          <w:sz w:val="20"/>
+          <w:szCs w:val="24"/>
+        </w:rPr>
+        <w:t xml:space="preserve"> inference service. On the supported subset of the Medical Waste 4.0 external dataset, the Expanded ResNet50 Stage 2 achieved 99.14% classification accuracy, with 6,195 correct predictions out of 6,249 supported images.</w:t>
       </w:r>
     </w:p>
     <w:p>
       <w:pPr>
         <w:rPr>
-          <w:rFonts w:hint="eastAsia"/>
+          <w:sz w:val="20"/>
+          <w:szCs w:val="24"/>
         </w:rPr>
       </w:pPr>
       <w:r>
+        <w:rPr>
+          <w:sz w:val="20"/>
+          <w:szCs w:val="24"/>
+        </w:rPr>
         <w:t>The detector benchmark is substantially weaker than the classifier benchmark, so the external classification result must not be interpreted as end-to-end system accuracy.</w:t>
       </w:r>
     </w:p>
@@ -460,11 +568,32 @@
     <w:p>
       <w:pPr>
         <w:rPr>
-          <w:rFonts w:hint="eastAsia"/>
+          <w:sz w:val="20"/>
+          <w:szCs w:val="24"/>
         </w:rPr>
       </w:pPr>
       <w:r>
-        <w:t>Waste segregation is difficult when images contain visually similar materials, mixed objects, medical waste, or items outside the training distribution. WasteWise AI was developed as a software-first computer-vision pipeline that detects objects, assigns a detailed waste class, evaluates whether the image belongs to the supported feature space, checks detector–classifier compatibility, and returns disposal guidance.</w:t>
+        <w:rPr>
+          <w:sz w:val="20"/>
+          <w:szCs w:val="24"/>
+        </w:rPr>
+        <w:t xml:space="preserve">Waste segregation is difficult when images contain visually similar materials, mixed objects, medical waste, or items outside the training distribution. </w:t>
+      </w:r>
+      <w:proofErr w:type="spellStart"/>
+      <w:r>
+        <w:rPr>
+          <w:sz w:val="20"/>
+          <w:szCs w:val="24"/>
+        </w:rPr>
+        <w:t>WasteWise</w:t>
+      </w:r>
+      <w:proofErr w:type="spellEnd"/>
+      <w:r>
+        <w:rPr>
+          <w:sz w:val="20"/>
+          <w:szCs w:val="24"/>
+        </w:rPr>
+        <w:t xml:space="preserve"> AI was developed as a software-first computer-vision pipeline that detects objects, assigns a detailed waste class, evaluates whether the image belongs to the supported feature space, checks detector–classifier compatibility, and returns disposal guidance.</w:t>
       </w:r>
     </w:p>
     <w:p>
@@ -478,16 +607,25 @@
     <w:p>
       <w:pPr>
         <w:rPr>
-          <w:rFonts w:hint="eastAsia"/>
+          <w:sz w:val="20"/>
+          <w:szCs w:val="24"/>
         </w:rPr>
       </w:pPr>
       <w:r>
+        <w:rPr>
+          <w:sz w:val="20"/>
+          <w:szCs w:val="24"/>
+        </w:rPr>
         <w:t>Design and implement an AI-based waste analysis system capable of locating waste objects in an image, classifying them into multiple waste categories, identifying unsupported inputs, reducing inconsistent predictions, and translating accepted predictions into practical disposal guidance.</w:t>
       </w:r>
     </w:p>
     <w:p>
       <w:pPr>
         <w:pStyle w:val="Heading1"/>
+        <w:rPr>
+          <w:sz w:val="32"/>
+          <w:szCs w:val="32"/>
+        </w:rPr>
       </w:pPr>
       <w:r>
         <w:t>4. Objectives</w:t>
@@ -497,10 +635,15 @@
       <w:pPr>
         <w:pStyle w:val="ListBullet"/>
         <w:rPr>
-          <w:rFonts w:hint="eastAsia"/>
+          <w:sz w:val="20"/>
+          <w:szCs w:val="24"/>
         </w:rPr>
       </w:pPr>
       <w:r>
+        <w:rPr>
+          <w:sz w:val="20"/>
+          <w:szCs w:val="24"/>
+        </w:rPr>
         <w:t>Build a multi-stage computer-vision pipeline for waste detection and classification.</w:t>
       </w:r>
     </w:p>
@@ -508,10 +651,15 @@
       <w:pPr>
         <w:pStyle w:val="ListBullet"/>
         <w:rPr>
-          <w:rFonts w:hint="eastAsia"/>
+          <w:sz w:val="20"/>
+          <w:szCs w:val="24"/>
         </w:rPr>
       </w:pPr>
       <w:r>
+        <w:rPr>
+          <w:sz w:val="20"/>
+          <w:szCs w:val="24"/>
+        </w:rPr>
         <w:t>Use YOLO11s for object localization and ResNet50 for fine-grained classification.</w:t>
       </w:r>
     </w:p>
@@ -519,10 +667,15 @@
       <w:pPr>
         <w:pStyle w:val="ListBullet"/>
         <w:rPr>
-          <w:rFonts w:hint="eastAsia"/>
+          <w:sz w:val="20"/>
+          <w:szCs w:val="24"/>
         </w:rPr>
       </w:pPr>
       <w:r>
+        <w:rPr>
+          <w:sz w:val="20"/>
+          <w:szCs w:val="24"/>
+        </w:rPr>
         <w:t>Support a 19-class detailed waste taxonomy including medical-waste classes.</w:t>
       </w:r>
     </w:p>
@@ -530,10 +683,15 @@
       <w:pPr>
         <w:pStyle w:val="ListBullet"/>
         <w:rPr>
-          <w:rFonts w:hint="eastAsia"/>
+          <w:sz w:val="20"/>
+          <w:szCs w:val="24"/>
         </w:rPr>
       </w:pPr>
       <w:r>
+        <w:rPr>
+          <w:sz w:val="20"/>
+          <w:szCs w:val="24"/>
+        </w:rPr>
         <w:t>Implement calibrated OOD rejection using deep feature embeddings and cosine similarity.</w:t>
       </w:r>
     </w:p>
@@ -541,10 +699,15 @@
       <w:pPr>
         <w:pStyle w:val="ListBullet"/>
         <w:rPr>
-          <w:rFonts w:hint="eastAsia"/>
+          <w:sz w:val="20"/>
+          <w:szCs w:val="24"/>
         </w:rPr>
       </w:pPr>
       <w:r>
+        <w:rPr>
+          <w:sz w:val="20"/>
+          <w:szCs w:val="24"/>
+        </w:rPr>
         <w:t>Add a semantic compatibility gate between detector and classifier outputs.</w:t>
       </w:r>
     </w:p>
@@ -552,30 +715,47 @@
       <w:pPr>
         <w:pStyle w:val="ListBullet"/>
         <w:rPr>
-          <w:rFonts w:hint="eastAsia"/>
+          <w:sz w:val="20"/>
+          <w:szCs w:val="24"/>
         </w:rPr>
       </w:pPr>
       <w:r>
-        <w:t>Provide a deployable FastAPI backend for image inference and structured results.</w:t>
+        <w:rPr>
+          <w:sz w:val="20"/>
+          <w:szCs w:val="24"/>
+        </w:rPr>
+        <w:t xml:space="preserve">Provide a deployable </w:t>
+      </w:r>
+      <w:proofErr w:type="spellStart"/>
+      <w:r>
+        <w:rPr>
+          <w:sz w:val="20"/>
+          <w:szCs w:val="24"/>
+        </w:rPr>
+        <w:t>FastAPI</w:t>
+      </w:r>
+      <w:proofErr w:type="spellEnd"/>
+      <w:r>
+        <w:rPr>
+          <w:sz w:val="20"/>
+          <w:szCs w:val="24"/>
+        </w:rPr>
+        <w:t xml:space="preserve"> backend for image inference and structured results.</w:t>
       </w:r>
     </w:p>
     <w:p>
       <w:pPr>
         <w:pStyle w:val="ListBullet"/>
-        <w:rPr>
-          <w:rFonts w:hint="eastAsia"/>
-        </w:rPr>
       </w:pPr>
       <w:r>
+        <w:rPr>
+          <w:sz w:val="20"/>
+          <w:szCs w:val="24"/>
+        </w:rPr>
         <w:t>Evaluate the classifier on an external Medical Waste 4.0 dataset.</w:t>
       </w:r>
     </w:p>
     <w:p>
-      <w:pPr>
-        <w:rPr>
-          <w:rFonts w:hint="eastAsia"/>
-        </w:rPr>
-      </w:pPr>
       <w:r>
         <w:br w:type="page"/>
       </w:r>
@@ -592,11 +772,25 @@
     <w:p>
       <w:pPr>
         <w:rPr>
-          <w:rFonts w:hint="eastAsia"/>
-        </w:rPr>
-      </w:pPr>
+          <w:sz w:val="20"/>
+          <w:szCs w:val="24"/>
+        </w:rPr>
+      </w:pPr>
+      <w:proofErr w:type="spellStart"/>
       <w:r>
-        <w:t>WasteWise AI uses multiple waste datasets and maintains dedicated audit tooling for dataset integrity, taxonomy mapping, annotation checks, duplicate provenance, and cross-split hash checks. The repository contains canonical manifests and validation outputs.</w:t>
+        <w:rPr>
+          <w:sz w:val="20"/>
+          <w:szCs w:val="24"/>
+        </w:rPr>
+        <w:t>WasteWise</w:t>
+      </w:r>
+      <w:proofErr w:type="spellEnd"/>
+      <w:r>
+        <w:rPr>
+          <w:sz w:val="20"/>
+          <w:szCs w:val="24"/>
+        </w:rPr>
+        <w:t xml:space="preserve"> AI uses multiple waste datasets and maintains dedicated audit tooling for dataset integrity, taxonomy mapping, annotation checks, duplicate provenance, and cross-split hash checks. The repository contains canonical manifests and validation outputs.</w:t>
       </w:r>
     </w:p>
     <w:tbl>
@@ -623,12 +817,15 @@
           <w:p>
             <w:pPr>
               <w:rPr>
-                <w:rFonts w:hint="eastAsia"/>
+                <w:sz w:val="20"/>
+                <w:szCs w:val="24"/>
               </w:rPr>
             </w:pPr>
             <w:r>
               <w:rPr>
                 <w:b/>
+                <w:sz w:val="20"/>
+                <w:szCs w:val="24"/>
               </w:rPr>
               <w:t>Component</w:t>
             </w:r>
@@ -643,12 +840,15 @@
           <w:p>
             <w:pPr>
               <w:rPr>
-                <w:rFonts w:hint="eastAsia"/>
+                <w:sz w:val="20"/>
+                <w:szCs w:val="24"/>
               </w:rPr>
             </w:pPr>
             <w:r>
               <w:rPr>
                 <w:b/>
+                <w:sz w:val="20"/>
+                <w:szCs w:val="24"/>
               </w:rPr>
               <w:t>Purpose</w:t>
             </w:r>
@@ -667,10 +867,15 @@
           <w:p>
             <w:pPr>
               <w:rPr>
-                <w:rFonts w:hint="eastAsia"/>
+                <w:sz w:val="20"/>
+                <w:szCs w:val="24"/>
               </w:rPr>
             </w:pPr>
             <w:r>
+              <w:rPr>
+                <w:sz w:val="20"/>
+                <w:szCs w:val="24"/>
+              </w:rPr>
               <w:t>Canonical manifest</w:t>
             </w:r>
           </w:p>
@@ -683,10 +888,15 @@
           <w:p>
             <w:pPr>
               <w:rPr>
-                <w:rFonts w:hint="eastAsia"/>
+                <w:sz w:val="20"/>
+                <w:szCs w:val="24"/>
               </w:rPr>
             </w:pPr>
             <w:r>
+              <w:rPr>
+                <w:sz w:val="20"/>
+                <w:szCs w:val="24"/>
+              </w:rPr>
               <w:t>Project-level image inventory and provenance.</w:t>
             </w:r>
           </w:p>
@@ -704,10 +914,15 @@
           <w:p>
             <w:pPr>
               <w:rPr>
-                <w:rFonts w:hint="eastAsia"/>
+                <w:sz w:val="20"/>
+                <w:szCs w:val="24"/>
               </w:rPr>
             </w:pPr>
             <w:r>
+              <w:rPr>
+                <w:sz w:val="20"/>
+                <w:szCs w:val="24"/>
+              </w:rPr>
               <w:t>Dataset integrity audits</w:t>
             </w:r>
           </w:p>
@@ -720,10 +935,15 @@
           <w:p>
             <w:pPr>
               <w:rPr>
-                <w:rFonts w:hint="eastAsia"/>
+                <w:sz w:val="20"/>
+                <w:szCs w:val="24"/>
               </w:rPr>
             </w:pPr>
             <w:r>
+              <w:rPr>
+                <w:sz w:val="20"/>
+                <w:szCs w:val="24"/>
+              </w:rPr>
               <w:t>Check expected structures and image consistency.</w:t>
             </w:r>
           </w:p>
@@ -741,10 +961,15 @@
           <w:p>
             <w:pPr>
               <w:rPr>
-                <w:rFonts w:hint="eastAsia"/>
+                <w:sz w:val="20"/>
+                <w:szCs w:val="24"/>
               </w:rPr>
             </w:pPr>
             <w:r>
+              <w:rPr>
+                <w:sz w:val="20"/>
+                <w:szCs w:val="24"/>
+              </w:rPr>
               <w:t>Taxonomy audits</w:t>
             </w:r>
           </w:p>
@@ -757,11 +982,32 @@
           <w:p>
             <w:pPr>
               <w:rPr>
-                <w:rFonts w:hint="eastAsia"/>
+                <w:sz w:val="20"/>
+                <w:szCs w:val="24"/>
               </w:rPr>
             </w:pPr>
             <w:r>
-              <w:t>Map source labels into WasteWise categories.</w:t>
+              <w:rPr>
+                <w:sz w:val="20"/>
+                <w:szCs w:val="24"/>
+              </w:rPr>
+              <w:t xml:space="preserve">Map source labels into </w:t>
+            </w:r>
+            <w:proofErr w:type="spellStart"/>
+            <w:r>
+              <w:rPr>
+                <w:sz w:val="20"/>
+                <w:szCs w:val="24"/>
+              </w:rPr>
+              <w:t>WasteWise</w:t>
+            </w:r>
+            <w:proofErr w:type="spellEnd"/>
+            <w:r>
+              <w:rPr>
+                <w:sz w:val="20"/>
+                <w:szCs w:val="24"/>
+              </w:rPr>
+              <w:t xml:space="preserve"> categories.</w:t>
             </w:r>
           </w:p>
         </w:tc>
@@ -778,10 +1024,15 @@
           <w:p>
             <w:pPr>
               <w:rPr>
-                <w:rFonts w:hint="eastAsia"/>
+                <w:sz w:val="20"/>
+                <w:szCs w:val="24"/>
               </w:rPr>
             </w:pPr>
             <w:r>
+              <w:rPr>
+                <w:sz w:val="20"/>
+                <w:szCs w:val="24"/>
+              </w:rPr>
               <w:t>Duplicate/hash audits</w:t>
             </w:r>
           </w:p>
@@ -794,10 +1045,15 @@
           <w:p>
             <w:pPr>
               <w:rPr>
-                <w:rFonts w:hint="eastAsia"/>
+                <w:sz w:val="20"/>
+                <w:szCs w:val="24"/>
               </w:rPr>
             </w:pPr>
             <w:r>
+              <w:rPr>
+                <w:sz w:val="20"/>
+                <w:szCs w:val="24"/>
+              </w:rPr>
               <w:t>Check exact and candidate duplicate overlap.</w:t>
             </w:r>
           </w:p>
@@ -815,10 +1071,15 @@
           <w:p>
             <w:pPr>
               <w:rPr>
-                <w:rFonts w:hint="eastAsia"/>
+                <w:sz w:val="20"/>
+                <w:szCs w:val="24"/>
               </w:rPr>
             </w:pPr>
             <w:r>
+              <w:rPr>
+                <w:sz w:val="20"/>
+                <w:szCs w:val="24"/>
+              </w:rPr>
               <w:t>Annotation audits</w:t>
             </w:r>
           </w:p>
@@ -831,10 +1092,15 @@
           <w:p>
             <w:pPr>
               <w:rPr>
-                <w:rFonts w:hint="eastAsia"/>
+                <w:sz w:val="20"/>
+                <w:szCs w:val="24"/>
               </w:rPr>
             </w:pPr>
             <w:r>
+              <w:rPr>
+                <w:sz w:val="20"/>
+                <w:szCs w:val="24"/>
+              </w:rPr>
               <w:t>Validate COCO/TACO-style detection annotations.</w:t>
             </w:r>
           </w:p>
@@ -852,11 +1118,32 @@
     <w:p>
       <w:pPr>
         <w:rPr>
-          <w:rFonts w:hint="eastAsia"/>
+          <w:sz w:val="20"/>
+          <w:szCs w:val="24"/>
         </w:rPr>
       </w:pPr>
       <w:r>
-        <w:t>The Medical Waste 4.0 audit discovered 6,321 image files. Seven supported WasteWise categories account for 6,249 images; 72 images were excluded as unsupported.</w:t>
+        <w:rPr>
+          <w:sz w:val="20"/>
+          <w:szCs w:val="24"/>
+        </w:rPr>
+        <w:t xml:space="preserve">The Medical Waste 4.0 audit discovered 6,321 image files. Seven supported </w:t>
+      </w:r>
+      <w:proofErr w:type="spellStart"/>
+      <w:r>
+        <w:rPr>
+          <w:sz w:val="20"/>
+          <w:szCs w:val="24"/>
+        </w:rPr>
+        <w:t>WasteWise</w:t>
+      </w:r>
+      <w:proofErr w:type="spellEnd"/>
+      <w:r>
+        <w:rPr>
+          <w:sz w:val="20"/>
+          <w:szCs w:val="24"/>
+        </w:rPr>
+        <w:t xml:space="preserve"> categories account for 6,249 images; 72 images were excluded as unsupported.</w:t>
       </w:r>
     </w:p>
     <w:tbl>
@@ -883,12 +1170,15 @@
           <w:p>
             <w:pPr>
               <w:rPr>
-                <w:rFonts w:hint="eastAsia"/>
+                <w:sz w:val="20"/>
+                <w:szCs w:val="24"/>
               </w:rPr>
             </w:pPr>
             <w:r>
               <w:rPr>
                 <w:b/>
+                <w:sz w:val="20"/>
+                <w:szCs w:val="24"/>
               </w:rPr>
               <w:t>Class</w:t>
             </w:r>
@@ -903,12 +1193,15 @@
           <w:p>
             <w:pPr>
               <w:rPr>
-                <w:rFonts w:hint="eastAsia"/>
+                <w:sz w:val="20"/>
+                <w:szCs w:val="24"/>
               </w:rPr>
             </w:pPr>
             <w:r>
               <w:rPr>
                 <w:b/>
+                <w:sz w:val="20"/>
+                <w:szCs w:val="24"/>
               </w:rPr>
               <w:t>Images</w:t>
             </w:r>
@@ -927,10 +1220,15 @@
           <w:p>
             <w:pPr>
               <w:rPr>
-                <w:rFonts w:hint="eastAsia"/>
+                <w:sz w:val="20"/>
+                <w:szCs w:val="24"/>
               </w:rPr>
             </w:pPr>
             <w:r>
+              <w:rPr>
+                <w:sz w:val="20"/>
+                <w:szCs w:val="24"/>
+              </w:rPr>
               <w:t>gauze</w:t>
             </w:r>
           </w:p>
@@ -943,10 +1241,15 @@
           <w:p>
             <w:pPr>
               <w:rPr>
-                <w:rFonts w:hint="eastAsia"/>
+                <w:sz w:val="20"/>
+                <w:szCs w:val="24"/>
               </w:rPr>
             </w:pPr>
             <w:r>
+              <w:rPr>
+                <w:sz w:val="20"/>
+                <w:szCs w:val="24"/>
+              </w:rPr>
               <w:t>630</w:t>
             </w:r>
           </w:p>
@@ -964,12 +1267,19 @@
           <w:p>
             <w:pPr>
               <w:rPr>
-                <w:rFonts w:hint="eastAsia"/>
+                <w:sz w:val="20"/>
+                <w:szCs w:val="24"/>
               </w:rPr>
             </w:pPr>
+            <w:proofErr w:type="spellStart"/>
             <w:r>
+              <w:rPr>
+                <w:sz w:val="20"/>
+                <w:szCs w:val="24"/>
+              </w:rPr>
               <w:t>medical_cap</w:t>
             </w:r>
+            <w:proofErr w:type="spellEnd"/>
           </w:p>
         </w:tc>
         <w:tc>
@@ -980,10 +1290,15 @@
           <w:p>
             <w:pPr>
               <w:rPr>
-                <w:rFonts w:hint="eastAsia"/>
+                <w:sz w:val="20"/>
+                <w:szCs w:val="24"/>
               </w:rPr>
             </w:pPr>
             <w:r>
+              <w:rPr>
+                <w:sz w:val="20"/>
+                <w:szCs w:val="24"/>
+              </w:rPr>
               <w:t>438</w:t>
             </w:r>
           </w:p>
@@ -1001,12 +1316,19 @@
           <w:p>
             <w:pPr>
               <w:rPr>
-                <w:rFonts w:hint="eastAsia"/>
+                <w:sz w:val="20"/>
+                <w:szCs w:val="24"/>
               </w:rPr>
             </w:pPr>
+            <w:proofErr w:type="spellStart"/>
             <w:r>
+              <w:rPr>
+                <w:sz w:val="20"/>
+                <w:szCs w:val="24"/>
+              </w:rPr>
               <w:t>medical_glasses</w:t>
             </w:r>
+            <w:proofErr w:type="spellEnd"/>
           </w:p>
         </w:tc>
         <w:tc>
@@ -1017,10 +1339,15 @@
           <w:p>
             <w:pPr>
               <w:rPr>
-                <w:rFonts w:hint="eastAsia"/>
+                <w:sz w:val="20"/>
+                <w:szCs w:val="24"/>
               </w:rPr>
             </w:pPr>
             <w:r>
+              <w:rPr>
+                <w:sz w:val="20"/>
+                <w:szCs w:val="24"/>
+              </w:rPr>
               <w:t>486</w:t>
             </w:r>
           </w:p>
@@ -1038,12 +1365,19 @@
           <w:p>
             <w:pPr>
               <w:rPr>
-                <w:rFonts w:hint="eastAsia"/>
+                <w:sz w:val="20"/>
+                <w:szCs w:val="24"/>
               </w:rPr>
             </w:pPr>
+            <w:proofErr w:type="spellStart"/>
             <w:r>
+              <w:rPr>
+                <w:sz w:val="20"/>
+                <w:szCs w:val="24"/>
+              </w:rPr>
               <w:t>medical_gloves</w:t>
             </w:r>
+            <w:proofErr w:type="spellEnd"/>
           </w:p>
         </w:tc>
         <w:tc>
@@ -1054,10 +1388,15 @@
           <w:p>
             <w:pPr>
               <w:rPr>
-                <w:rFonts w:hint="eastAsia"/>
+                <w:sz w:val="20"/>
+                <w:szCs w:val="24"/>
               </w:rPr>
             </w:pPr>
             <w:r>
+              <w:rPr>
+                <w:sz w:val="20"/>
+                <w:szCs w:val="24"/>
+              </w:rPr>
               <w:t>2,787</w:t>
             </w:r>
           </w:p>
@@ -1075,12 +1414,19 @@
           <w:p>
             <w:pPr>
               <w:rPr>
-                <w:rFonts w:hint="eastAsia"/>
+                <w:sz w:val="20"/>
+                <w:szCs w:val="24"/>
               </w:rPr>
             </w:pPr>
+            <w:proofErr w:type="spellStart"/>
             <w:r>
+              <w:rPr>
+                <w:sz w:val="20"/>
+                <w:szCs w:val="24"/>
+              </w:rPr>
               <w:t>shoe_cover</w:t>
             </w:r>
+            <w:proofErr w:type="spellEnd"/>
           </w:p>
         </w:tc>
         <w:tc>
@@ -1091,10 +1437,15 @@
           <w:p>
             <w:pPr>
               <w:rPr>
-                <w:rFonts w:hint="eastAsia"/>
+                <w:sz w:val="20"/>
+                <w:szCs w:val="24"/>
               </w:rPr>
             </w:pPr>
             <w:r>
+              <w:rPr>
+                <w:sz w:val="20"/>
+                <w:szCs w:val="24"/>
+              </w:rPr>
               <w:t>972</w:t>
             </w:r>
           </w:p>
@@ -1112,12 +1463,19 @@
           <w:p>
             <w:pPr>
               <w:rPr>
-                <w:rFonts w:hint="eastAsia"/>
+                <w:sz w:val="20"/>
+                <w:szCs w:val="24"/>
               </w:rPr>
             </w:pPr>
+            <w:proofErr w:type="spellStart"/>
             <w:r>
+              <w:rPr>
+                <w:sz w:val="20"/>
+                <w:szCs w:val="24"/>
+              </w:rPr>
               <w:t>test_tube</w:t>
             </w:r>
+            <w:proofErr w:type="spellEnd"/>
           </w:p>
         </w:tc>
         <w:tc>
@@ -1128,10 +1486,15 @@
           <w:p>
             <w:pPr>
               <w:rPr>
-                <w:rFonts w:hint="eastAsia"/>
+                <w:sz w:val="20"/>
+                <w:szCs w:val="24"/>
               </w:rPr>
             </w:pPr>
             <w:r>
+              <w:rPr>
+                <w:sz w:val="20"/>
+                <w:szCs w:val="24"/>
+              </w:rPr>
               <w:t>483</w:t>
             </w:r>
           </w:p>
@@ -1149,12 +1512,19 @@
           <w:p>
             <w:pPr>
               <w:rPr>
-                <w:rFonts w:hint="eastAsia"/>
+                <w:sz w:val="20"/>
+                <w:szCs w:val="24"/>
               </w:rPr>
             </w:pPr>
+            <w:proofErr w:type="spellStart"/>
             <w:r>
+              <w:rPr>
+                <w:sz w:val="20"/>
+                <w:szCs w:val="24"/>
+              </w:rPr>
               <w:t>urine_bag</w:t>
             </w:r>
+            <w:proofErr w:type="spellEnd"/>
           </w:p>
         </w:tc>
         <w:tc>
@@ -1165,10 +1535,15 @@
           <w:p>
             <w:pPr>
               <w:rPr>
-                <w:rFonts w:hint="eastAsia"/>
+                <w:sz w:val="20"/>
+                <w:szCs w:val="24"/>
               </w:rPr>
             </w:pPr>
             <w:r>
+              <w:rPr>
+                <w:sz w:val="20"/>
+                <w:szCs w:val="24"/>
+              </w:rPr>
               <w:t>453</w:t>
             </w:r>
           </w:p>
@@ -1186,10 +1561,15 @@
           <w:p>
             <w:pPr>
               <w:rPr>
-                <w:rFonts w:hint="eastAsia"/>
+                <w:sz w:val="20"/>
+                <w:szCs w:val="24"/>
               </w:rPr>
             </w:pPr>
             <w:r>
+              <w:rPr>
+                <w:sz w:val="20"/>
+                <w:szCs w:val="24"/>
+              </w:rPr>
               <w:t>Total supported</w:t>
             </w:r>
           </w:p>
@@ -1202,10 +1582,15 @@
           <w:p>
             <w:pPr>
               <w:rPr>
-                <w:rFonts w:hint="eastAsia"/>
+                <w:sz w:val="20"/>
+                <w:szCs w:val="24"/>
               </w:rPr>
             </w:pPr>
             <w:r>
+              <w:rPr>
+                <w:sz w:val="20"/>
+                <w:szCs w:val="24"/>
+              </w:rPr>
               <w:t>6,249</w:t>
             </w:r>
           </w:p>
@@ -1223,10 +1608,15 @@
           <w:p>
             <w:pPr>
               <w:rPr>
-                <w:rFonts w:hint="eastAsia"/>
+                <w:sz w:val="20"/>
+                <w:szCs w:val="24"/>
               </w:rPr>
             </w:pPr>
             <w:r>
+              <w:rPr>
+                <w:sz w:val="20"/>
+                <w:szCs w:val="24"/>
+              </w:rPr>
               <w:t>Unsupported</w:t>
             </w:r>
           </w:p>
@@ -1239,10 +1629,15 @@
           <w:p>
             <w:pPr>
               <w:rPr>
-                <w:rFonts w:hint="eastAsia"/>
+                <w:sz w:val="20"/>
+                <w:szCs w:val="24"/>
               </w:rPr>
             </w:pPr>
             <w:r>
+              <w:rPr>
+                <w:sz w:val="20"/>
+                <w:szCs w:val="24"/>
+              </w:rPr>
               <w:t>72</w:t>
             </w:r>
           </w:p>
@@ -1260,10 +1655,15 @@
     <w:p>
       <w:pPr>
         <w:rPr>
-          <w:rFonts w:hint="eastAsia"/>
+          <w:sz w:val="20"/>
+          <w:szCs w:val="24"/>
         </w:rPr>
       </w:pPr>
       <w:r>
+        <w:rPr>
+          <w:sz w:val="20"/>
+          <w:szCs w:val="24"/>
+        </w:rPr>
         <w:t>The controlled benchmark verifies the production preprocessing sequence: resize to 256, center-crop to 224×224, convert to tensor, and apply ImageNet normalization.</w:t>
       </w:r>
     </w:p>
@@ -1291,12 +1691,15 @@
           <w:p>
             <w:pPr>
               <w:rPr>
-                <w:rFonts w:hint="eastAsia"/>
+                <w:sz w:val="20"/>
+                <w:szCs w:val="24"/>
               </w:rPr>
             </w:pPr>
             <w:r>
               <w:rPr>
                 <w:b/>
+                <w:sz w:val="20"/>
+                <w:szCs w:val="24"/>
               </w:rPr>
               <w:t>Step</w:t>
             </w:r>
@@ -1311,12 +1714,15 @@
           <w:p>
             <w:pPr>
               <w:rPr>
-                <w:rFonts w:hint="eastAsia"/>
+                <w:sz w:val="20"/>
+                <w:szCs w:val="24"/>
               </w:rPr>
             </w:pPr>
             <w:r>
               <w:rPr>
                 <w:b/>
+                <w:sz w:val="20"/>
+                <w:szCs w:val="24"/>
               </w:rPr>
               <w:t>Configuration</w:t>
             </w:r>
@@ -1335,10 +1741,15 @@
           <w:p>
             <w:pPr>
               <w:rPr>
-                <w:rFonts w:hint="eastAsia"/>
+                <w:sz w:val="20"/>
+                <w:szCs w:val="24"/>
               </w:rPr>
             </w:pPr>
             <w:r>
+              <w:rPr>
+                <w:sz w:val="20"/>
+                <w:szCs w:val="24"/>
+              </w:rPr>
               <w:t>Resize</w:t>
             </w:r>
           </w:p>
@@ -1351,10 +1762,15 @@
           <w:p>
             <w:pPr>
               <w:rPr>
-                <w:rFonts w:hint="eastAsia"/>
+                <w:sz w:val="20"/>
+                <w:szCs w:val="24"/>
               </w:rPr>
             </w:pPr>
             <w:r>
+              <w:rPr>
+                <w:sz w:val="20"/>
+                <w:szCs w:val="24"/>
+              </w:rPr>
               <w:t>256</w:t>
             </w:r>
           </w:p>
@@ -1372,10 +1788,15 @@
           <w:p>
             <w:pPr>
               <w:rPr>
-                <w:rFonts w:hint="eastAsia"/>
+                <w:sz w:val="20"/>
+                <w:szCs w:val="24"/>
               </w:rPr>
             </w:pPr>
             <w:r>
+              <w:rPr>
+                <w:sz w:val="20"/>
+                <w:szCs w:val="24"/>
+              </w:rPr>
               <w:t>Center crop</w:t>
             </w:r>
           </w:p>
@@ -1388,10 +1809,15 @@
           <w:p>
             <w:pPr>
               <w:rPr>
-                <w:rFonts w:hint="eastAsia"/>
+                <w:sz w:val="20"/>
+                <w:szCs w:val="24"/>
               </w:rPr>
             </w:pPr>
             <w:r>
+              <w:rPr>
+                <w:sz w:val="20"/>
+                <w:szCs w:val="24"/>
+              </w:rPr>
               <w:t>224 × 224</w:t>
             </w:r>
           </w:p>
@@ -1409,10 +1835,15 @@
           <w:p>
             <w:pPr>
               <w:rPr>
-                <w:rFonts w:hint="eastAsia"/>
+                <w:sz w:val="20"/>
+                <w:szCs w:val="24"/>
               </w:rPr>
             </w:pPr>
             <w:r>
+              <w:rPr>
+                <w:sz w:val="20"/>
+                <w:szCs w:val="24"/>
+              </w:rPr>
               <w:t>Tensor conversion</w:t>
             </w:r>
           </w:p>
@@ -1425,12 +1856,19 @@
           <w:p>
             <w:pPr>
               <w:rPr>
-                <w:rFonts w:hint="eastAsia"/>
+                <w:sz w:val="20"/>
+                <w:szCs w:val="24"/>
               </w:rPr>
             </w:pPr>
+            <w:proofErr w:type="spellStart"/>
             <w:r>
+              <w:rPr>
+                <w:sz w:val="20"/>
+                <w:szCs w:val="24"/>
+              </w:rPr>
               <w:t>ToTensor</w:t>
             </w:r>
+            <w:proofErr w:type="spellEnd"/>
           </w:p>
         </w:tc>
       </w:tr>
@@ -1446,10 +1884,15 @@
           <w:p>
             <w:pPr>
               <w:rPr>
-                <w:rFonts w:hint="eastAsia"/>
+                <w:sz w:val="20"/>
+                <w:szCs w:val="24"/>
               </w:rPr>
             </w:pPr>
             <w:r>
+              <w:rPr>
+                <w:sz w:val="20"/>
+                <w:szCs w:val="24"/>
+              </w:rPr>
               <w:t>Mean</w:t>
             </w:r>
           </w:p>
@@ -1462,10 +1905,15 @@
           <w:p>
             <w:pPr>
               <w:rPr>
-                <w:rFonts w:hint="eastAsia"/>
+                <w:sz w:val="20"/>
+                <w:szCs w:val="24"/>
               </w:rPr>
             </w:pPr>
             <w:r>
+              <w:rPr>
+                <w:sz w:val="20"/>
+                <w:szCs w:val="24"/>
+              </w:rPr>
               <w:t>[0.485, 0.456, 0.406]</w:t>
             </w:r>
           </w:p>
@@ -1483,10 +1931,15 @@
           <w:p>
             <w:pPr>
               <w:rPr>
-                <w:rFonts w:hint="eastAsia"/>
+                <w:sz w:val="20"/>
+                <w:szCs w:val="24"/>
               </w:rPr>
             </w:pPr>
             <w:r>
+              <w:rPr>
+                <w:sz w:val="20"/>
+                <w:szCs w:val="24"/>
+              </w:rPr>
               <w:t>Std</w:t>
             </w:r>
           </w:p>
@@ -1499,10 +1952,15 @@
           <w:p>
             <w:pPr>
               <w:rPr>
-                <w:rFonts w:hint="eastAsia"/>
+                <w:sz w:val="20"/>
+                <w:szCs w:val="24"/>
               </w:rPr>
             </w:pPr>
             <w:r>
+              <w:rPr>
+                <w:sz w:val="20"/>
+                <w:szCs w:val="24"/>
+              </w:rPr>
               <w:t>[0.229, 0.224, 0.225]</w:t>
             </w:r>
           </w:p>
@@ -1520,30 +1978,199 @@
     <w:p>
       <w:pPr>
         <w:rPr>
-          <w:rFonts w:hint="eastAsia"/>
+          <w:sz w:val="20"/>
+          <w:szCs w:val="24"/>
         </w:rPr>
       </w:pPr>
       <w:r>
-        <w:t>YOLO11s uses six practical classes: plastic, glass, metal, paper_cardboard, biological, and other_trash.</w:t>
+        <w:rPr>
+          <w:sz w:val="20"/>
+          <w:szCs w:val="24"/>
+        </w:rPr>
+        <w:t xml:space="preserve">YOLO11s uses six practical classes: plastic, glass, metal, </w:t>
+      </w:r>
+      <w:proofErr w:type="spellStart"/>
+      <w:r>
+        <w:rPr>
+          <w:sz w:val="20"/>
+          <w:szCs w:val="24"/>
+        </w:rPr>
+        <w:t>paper_cardboard</w:t>
+      </w:r>
+      <w:proofErr w:type="spellEnd"/>
+      <w:r>
+        <w:rPr>
+          <w:sz w:val="20"/>
+          <w:szCs w:val="24"/>
+        </w:rPr>
+        <w:t xml:space="preserve">, biological, and </w:t>
+      </w:r>
+      <w:proofErr w:type="spellStart"/>
+      <w:r>
+        <w:rPr>
+          <w:sz w:val="20"/>
+          <w:szCs w:val="24"/>
+        </w:rPr>
+        <w:t>other_trash</w:t>
+      </w:r>
+      <w:proofErr w:type="spellEnd"/>
+      <w:r>
+        <w:rPr>
+          <w:sz w:val="20"/>
+          <w:szCs w:val="24"/>
+        </w:rPr>
+        <w:t>.</w:t>
       </w:r>
     </w:p>
     <w:p>
       <w:pPr>
         <w:rPr>
-          <w:rFonts w:hint="eastAsia"/>
+          <w:sz w:val="20"/>
+          <w:szCs w:val="24"/>
         </w:rPr>
       </w:pPr>
       <w:r>
-        <w:t>The Expanded ResNet50 uses 19 detailed classes: battery, biological, cable, cardboard, clothes, electronic_device, gauze, general_trash, glass, medical_cap, medical_glasses, medical_gloves, metal, paper, plastic, shoe_cover, shoes, test_tube, and urine_bag.</w:t>
+        <w:rPr>
+          <w:sz w:val="20"/>
+          <w:szCs w:val="24"/>
+        </w:rPr>
+        <w:t xml:space="preserve">The Expanded ResNet50 uses 19 detailed classes: battery, biological, cable, cardboard, clothes, </w:t>
+      </w:r>
+      <w:proofErr w:type="spellStart"/>
+      <w:r>
+        <w:rPr>
+          <w:sz w:val="20"/>
+          <w:szCs w:val="24"/>
+        </w:rPr>
+        <w:t>electronic_device</w:t>
+      </w:r>
+      <w:proofErr w:type="spellEnd"/>
+      <w:r>
+        <w:rPr>
+          <w:sz w:val="20"/>
+          <w:szCs w:val="24"/>
+        </w:rPr>
+        <w:t xml:space="preserve">, gauze, </w:t>
+      </w:r>
+      <w:proofErr w:type="spellStart"/>
+      <w:r>
+        <w:rPr>
+          <w:sz w:val="20"/>
+          <w:szCs w:val="24"/>
+        </w:rPr>
+        <w:t>general_trash</w:t>
+      </w:r>
+      <w:proofErr w:type="spellEnd"/>
+      <w:r>
+        <w:rPr>
+          <w:sz w:val="20"/>
+          <w:szCs w:val="24"/>
+        </w:rPr>
+        <w:t xml:space="preserve">, glass, </w:t>
+      </w:r>
+      <w:proofErr w:type="spellStart"/>
+      <w:r>
+        <w:rPr>
+          <w:sz w:val="20"/>
+          <w:szCs w:val="24"/>
+        </w:rPr>
+        <w:t>medical_cap</w:t>
+      </w:r>
+      <w:proofErr w:type="spellEnd"/>
+      <w:r>
+        <w:rPr>
+          <w:sz w:val="20"/>
+          <w:szCs w:val="24"/>
+        </w:rPr>
+        <w:t xml:space="preserve">, </w:t>
+      </w:r>
+      <w:proofErr w:type="spellStart"/>
+      <w:r>
+        <w:rPr>
+          <w:sz w:val="20"/>
+          <w:szCs w:val="24"/>
+        </w:rPr>
+        <w:t>medical_glasses</w:t>
+      </w:r>
+      <w:proofErr w:type="spellEnd"/>
+      <w:r>
+        <w:rPr>
+          <w:sz w:val="20"/>
+          <w:szCs w:val="24"/>
+        </w:rPr>
+        <w:t xml:space="preserve">, </w:t>
+      </w:r>
+      <w:proofErr w:type="spellStart"/>
+      <w:r>
+        <w:rPr>
+          <w:sz w:val="20"/>
+          <w:szCs w:val="24"/>
+        </w:rPr>
+        <w:t>medical_gloves</w:t>
+      </w:r>
+      <w:proofErr w:type="spellEnd"/>
+      <w:r>
+        <w:rPr>
+          <w:sz w:val="20"/>
+          <w:szCs w:val="24"/>
+        </w:rPr>
+        <w:t xml:space="preserve">, metal, paper, plastic, </w:t>
+      </w:r>
+      <w:proofErr w:type="spellStart"/>
+      <w:r>
+        <w:rPr>
+          <w:sz w:val="20"/>
+          <w:szCs w:val="24"/>
+        </w:rPr>
+        <w:t>shoe_cover</w:t>
+      </w:r>
+      <w:proofErr w:type="spellEnd"/>
+      <w:r>
+        <w:rPr>
+          <w:sz w:val="20"/>
+          <w:szCs w:val="24"/>
+        </w:rPr>
+        <w:t xml:space="preserve">, shoes, </w:t>
+      </w:r>
+      <w:proofErr w:type="spellStart"/>
+      <w:r>
+        <w:rPr>
+          <w:sz w:val="20"/>
+          <w:szCs w:val="24"/>
+        </w:rPr>
+        <w:t>test_tube</w:t>
+      </w:r>
+      <w:proofErr w:type="spellEnd"/>
+      <w:r>
+        <w:rPr>
+          <w:sz w:val="20"/>
+          <w:szCs w:val="24"/>
+        </w:rPr>
+        <w:t xml:space="preserve">, and </w:t>
+      </w:r>
+      <w:proofErr w:type="spellStart"/>
+      <w:r>
+        <w:rPr>
+          <w:sz w:val="20"/>
+          <w:szCs w:val="24"/>
+        </w:rPr>
+        <w:t>urine_bag</w:t>
+      </w:r>
+      <w:proofErr w:type="spellEnd"/>
+      <w:r>
+        <w:rPr>
+          <w:sz w:val="20"/>
+          <w:szCs w:val="24"/>
+        </w:rPr>
+        <w:t>.</w:t>
       </w:r>
     </w:p>
     <w:p>
-      <w:pPr>
-        <w:rPr>
-          <w:rFonts w:hint="eastAsia"/>
-        </w:rPr>
-      </w:pPr>
       <w:r>
+        <w:rPr>
+          <w:sz w:val="20"/>
+          <w:szCs w:val="24"/>
+        </w:rPr>
         <w:br w:type="page"/>
       </w:r>
     </w:p>
@@ -1559,10 +2186,15 @@
     <w:p>
       <w:pPr>
         <w:rPr>
-          <w:rFonts w:hint="eastAsia"/>
+          <w:sz w:val="20"/>
+          <w:szCs w:val="24"/>
         </w:rPr>
       </w:pPr>
       <w:r>
+        <w:rPr>
+          <w:sz w:val="20"/>
+          <w:szCs w:val="24"/>
+        </w:rPr>
         <w:t>The production pipeline is: Image → YOLO11s detection → expanded object crop → Expanded ResNet50 classification → Expanded OOD detector → semantic compatibility gate → disposal guidance.</w:t>
       </w:r>
     </w:p>
@@ -1591,12 +2223,15 @@
           <w:p>
             <w:pPr>
               <w:rPr>
-                <w:rFonts w:hint="eastAsia"/>
+                <w:sz w:val="20"/>
+                <w:szCs w:val="24"/>
               </w:rPr>
             </w:pPr>
             <w:r>
               <w:rPr>
                 <w:b/>
+                <w:sz w:val="20"/>
+                <w:szCs w:val="24"/>
               </w:rPr>
               <w:t>Stage</w:t>
             </w:r>
@@ -1611,12 +2246,15 @@
           <w:p>
             <w:pPr>
               <w:rPr>
-                <w:rFonts w:hint="eastAsia"/>
+                <w:sz w:val="20"/>
+                <w:szCs w:val="24"/>
               </w:rPr>
             </w:pPr>
             <w:r>
               <w:rPr>
                 <w:b/>
+                <w:sz w:val="20"/>
+                <w:szCs w:val="24"/>
               </w:rPr>
               <w:t>Operation</w:t>
             </w:r>
@@ -1631,12 +2269,15 @@
           <w:p>
             <w:pPr>
               <w:rPr>
-                <w:rFonts w:hint="eastAsia"/>
+                <w:sz w:val="20"/>
+                <w:szCs w:val="24"/>
               </w:rPr>
             </w:pPr>
             <w:r>
               <w:rPr>
                 <w:b/>
+                <w:sz w:val="20"/>
+                <w:szCs w:val="24"/>
               </w:rPr>
               <w:t>Output</w:t>
             </w:r>
@@ -1655,10 +2296,15 @@
           <w:p>
             <w:pPr>
               <w:rPr>
-                <w:rFonts w:hint="eastAsia"/>
+                <w:sz w:val="20"/>
+                <w:szCs w:val="24"/>
               </w:rPr>
             </w:pPr>
             <w:r>
+              <w:rPr>
+                <w:sz w:val="20"/>
+                <w:szCs w:val="24"/>
+              </w:rPr>
               <w:t>1</w:t>
             </w:r>
           </w:p>
@@ -1671,10 +2317,15 @@
           <w:p>
             <w:pPr>
               <w:rPr>
-                <w:rFonts w:hint="eastAsia"/>
+                <w:sz w:val="20"/>
+                <w:szCs w:val="24"/>
               </w:rPr>
             </w:pPr>
             <w:r>
+              <w:rPr>
+                <w:sz w:val="20"/>
+                <w:szCs w:val="24"/>
+              </w:rPr>
               <w:t>Input image</w:t>
             </w:r>
           </w:p>
@@ -1687,10 +2338,15 @@
           <w:p>
             <w:pPr>
               <w:rPr>
-                <w:rFonts w:hint="eastAsia"/>
+                <w:sz w:val="20"/>
+                <w:szCs w:val="24"/>
               </w:rPr>
             </w:pPr>
             <w:r>
+              <w:rPr>
+                <w:sz w:val="20"/>
+                <w:szCs w:val="24"/>
+              </w:rPr>
               <w:t>Image</w:t>
             </w:r>
           </w:p>
@@ -1708,10 +2364,15 @@
           <w:p>
             <w:pPr>
               <w:rPr>
-                <w:rFonts w:hint="eastAsia"/>
+                <w:sz w:val="20"/>
+                <w:szCs w:val="24"/>
               </w:rPr>
             </w:pPr>
             <w:r>
+              <w:rPr>
+                <w:sz w:val="20"/>
+                <w:szCs w:val="24"/>
+              </w:rPr>
               <w:t>2</w:t>
             </w:r>
           </w:p>
@@ -1724,10 +2385,15 @@
           <w:p>
             <w:pPr>
               <w:rPr>
-                <w:rFonts w:hint="eastAsia"/>
+                <w:sz w:val="20"/>
+                <w:szCs w:val="24"/>
               </w:rPr>
             </w:pPr>
             <w:r>
+              <w:rPr>
+                <w:sz w:val="20"/>
+                <w:szCs w:val="24"/>
+              </w:rPr>
               <w:t>YOLO11s</w:t>
             </w:r>
           </w:p>
@@ -1740,10 +2406,15 @@
           <w:p>
             <w:pPr>
               <w:rPr>
-                <w:rFonts w:hint="eastAsia"/>
+                <w:sz w:val="20"/>
+                <w:szCs w:val="24"/>
               </w:rPr>
             </w:pPr>
             <w:r>
+              <w:rPr>
+                <w:sz w:val="20"/>
+                <w:szCs w:val="24"/>
+              </w:rPr>
               <w:t>Boxes + practical class + confidence</w:t>
             </w:r>
           </w:p>
@@ -1761,10 +2432,15 @@
           <w:p>
             <w:pPr>
               <w:rPr>
-                <w:rFonts w:hint="eastAsia"/>
+                <w:sz w:val="20"/>
+                <w:szCs w:val="24"/>
               </w:rPr>
             </w:pPr>
             <w:r>
+              <w:rPr>
+                <w:sz w:val="20"/>
+                <w:szCs w:val="24"/>
+              </w:rPr>
               <w:t>3</w:t>
             </w:r>
           </w:p>
@@ -1777,10 +2453,15 @@
           <w:p>
             <w:pPr>
               <w:rPr>
-                <w:rFonts w:hint="eastAsia"/>
+                <w:sz w:val="20"/>
+                <w:szCs w:val="24"/>
               </w:rPr>
             </w:pPr>
             <w:r>
+              <w:rPr>
+                <w:sz w:val="20"/>
+                <w:szCs w:val="24"/>
+              </w:rPr>
               <w:t>Crop expansion</w:t>
             </w:r>
           </w:p>
@@ -1793,10 +2474,15 @@
           <w:p>
             <w:pPr>
               <w:rPr>
-                <w:rFonts w:hint="eastAsia"/>
+                <w:sz w:val="20"/>
+                <w:szCs w:val="24"/>
               </w:rPr>
             </w:pPr>
             <w:r>
+              <w:rPr>
+                <w:sz w:val="20"/>
+                <w:szCs w:val="24"/>
+              </w:rPr>
               <w:t>Classifier crop</w:t>
             </w:r>
           </w:p>
@@ -1814,10 +2500,15 @@
           <w:p>
             <w:pPr>
               <w:rPr>
-                <w:rFonts w:hint="eastAsia"/>
+                <w:sz w:val="20"/>
+                <w:szCs w:val="24"/>
               </w:rPr>
             </w:pPr>
             <w:r>
+              <w:rPr>
+                <w:sz w:val="20"/>
+                <w:szCs w:val="24"/>
+              </w:rPr>
               <w:t>4</w:t>
             </w:r>
           </w:p>
@@ -1830,10 +2521,15 @@
           <w:p>
             <w:pPr>
               <w:rPr>
-                <w:rFonts w:hint="eastAsia"/>
+                <w:sz w:val="20"/>
+                <w:szCs w:val="24"/>
               </w:rPr>
             </w:pPr>
             <w:r>
+              <w:rPr>
+                <w:sz w:val="20"/>
+                <w:szCs w:val="24"/>
+              </w:rPr>
               <w:t>ResNet50 Stage 2</w:t>
             </w:r>
           </w:p>
@@ -1846,10 +2542,15 @@
           <w:p>
             <w:pPr>
               <w:rPr>
-                <w:rFonts w:hint="eastAsia"/>
+                <w:sz w:val="20"/>
+                <w:szCs w:val="24"/>
               </w:rPr>
             </w:pPr>
             <w:r>
+              <w:rPr>
+                <w:sz w:val="20"/>
+                <w:szCs w:val="24"/>
+              </w:rPr>
               <w:t>19-class prediction</w:t>
             </w:r>
           </w:p>
@@ -1867,10 +2568,15 @@
           <w:p>
             <w:pPr>
               <w:rPr>
-                <w:rFonts w:hint="eastAsia"/>
+                <w:sz w:val="20"/>
+                <w:szCs w:val="24"/>
               </w:rPr>
             </w:pPr>
             <w:r>
+              <w:rPr>
+                <w:sz w:val="20"/>
+                <w:szCs w:val="24"/>
+              </w:rPr>
               <w:t>5</w:t>
             </w:r>
           </w:p>
@@ -1883,10 +2589,15 @@
           <w:p>
             <w:pPr>
               <w:rPr>
-                <w:rFonts w:hint="eastAsia"/>
+                <w:sz w:val="20"/>
+                <w:szCs w:val="24"/>
               </w:rPr>
             </w:pPr>
             <w:r>
+              <w:rPr>
+                <w:sz w:val="20"/>
+                <w:szCs w:val="24"/>
+              </w:rPr>
               <w:t>OOD detector</w:t>
             </w:r>
           </w:p>
@@ -1899,10 +2610,15 @@
           <w:p>
             <w:pPr>
               <w:rPr>
-                <w:rFonts w:hint="eastAsia"/>
+                <w:sz w:val="20"/>
+                <w:szCs w:val="24"/>
               </w:rPr>
             </w:pPr>
             <w:r>
+              <w:rPr>
+                <w:sz w:val="20"/>
+                <w:szCs w:val="24"/>
+              </w:rPr>
               <w:t>Support + similarity</w:t>
             </w:r>
           </w:p>
@@ -1920,10 +2636,15 @@
           <w:p>
             <w:pPr>
               <w:rPr>
-                <w:rFonts w:hint="eastAsia"/>
+                <w:sz w:val="20"/>
+                <w:szCs w:val="24"/>
               </w:rPr>
             </w:pPr>
             <w:r>
+              <w:rPr>
+                <w:sz w:val="20"/>
+                <w:szCs w:val="24"/>
+              </w:rPr>
               <w:t>6</w:t>
             </w:r>
           </w:p>
@@ -1936,10 +2657,15 @@
           <w:p>
             <w:pPr>
               <w:rPr>
-                <w:rFonts w:hint="eastAsia"/>
+                <w:sz w:val="20"/>
+                <w:szCs w:val="24"/>
               </w:rPr>
             </w:pPr>
             <w:r>
+              <w:rPr>
+                <w:sz w:val="20"/>
+                <w:szCs w:val="24"/>
+              </w:rPr>
               <w:t>Compatibility gate</w:t>
             </w:r>
           </w:p>
@@ -1952,10 +2678,15 @@
           <w:p>
             <w:pPr>
               <w:rPr>
-                <w:rFonts w:hint="eastAsia"/>
+                <w:sz w:val="20"/>
+                <w:szCs w:val="24"/>
               </w:rPr>
             </w:pPr>
             <w:r>
+              <w:rPr>
+                <w:sz w:val="20"/>
+                <w:szCs w:val="24"/>
+              </w:rPr>
               <w:t>Accepted/rejected</w:t>
             </w:r>
           </w:p>
@@ -1973,10 +2704,15 @@
           <w:p>
             <w:pPr>
               <w:rPr>
-                <w:rFonts w:hint="eastAsia"/>
+                <w:sz w:val="20"/>
+                <w:szCs w:val="24"/>
               </w:rPr>
             </w:pPr>
             <w:r>
+              <w:rPr>
+                <w:sz w:val="20"/>
+                <w:szCs w:val="24"/>
+              </w:rPr>
               <w:t>7</w:t>
             </w:r>
           </w:p>
@@ -1989,10 +2725,15 @@
           <w:p>
             <w:pPr>
               <w:rPr>
-                <w:rFonts w:hint="eastAsia"/>
+                <w:sz w:val="20"/>
+                <w:szCs w:val="24"/>
               </w:rPr>
             </w:pPr>
             <w:r>
+              <w:rPr>
+                <w:sz w:val="20"/>
+                <w:szCs w:val="24"/>
+              </w:rPr>
               <w:t>Guidance</w:t>
             </w:r>
           </w:p>
@@ -2005,10 +2746,15 @@
           <w:p>
             <w:pPr>
               <w:rPr>
-                <w:rFonts w:hint="eastAsia"/>
+                <w:sz w:val="20"/>
+                <w:szCs w:val="24"/>
               </w:rPr>
             </w:pPr>
             <w:r>
+              <w:rPr>
+                <w:sz w:val="20"/>
+                <w:szCs w:val="24"/>
+              </w:rPr>
               <w:t>Disposal recommendation</w:t>
             </w:r>
           </w:p>
@@ -2026,20 +2772,30 @@
     <w:p>
       <w:pPr>
         <w:rPr>
-          <w:rFonts w:hint="eastAsia"/>
+          <w:sz w:val="20"/>
+          <w:szCs w:val="24"/>
         </w:rPr>
       </w:pPr>
       <w:r>
+        <w:rPr>
+          <w:sz w:val="20"/>
+          <w:szCs w:val="24"/>
+        </w:rPr>
         <w:t>E4 detector validation contained 149 images and 407 instances. Precision was 0.216, recall 0.261, mAP@0.50 0.232, and mAP@0.50:0.95 0.188.</w:t>
       </w:r>
     </w:p>
     <w:p>
       <w:pPr>
         <w:rPr>
-          <w:rFonts w:hint="eastAsia"/>
+          <w:sz w:val="20"/>
+          <w:szCs w:val="24"/>
         </w:rPr>
       </w:pPr>
       <w:r>
+        <w:rPr>
+          <w:sz w:val="20"/>
+          <w:szCs w:val="24"/>
+        </w:rPr>
         <w:t>A TACO practical baseline reported precision 0.282, recall 0.387, mAP@0.50 0.306, and mAP@0.50:0.95 0.236.</w:t>
       </w:r>
     </w:p>
@@ -2054,20 +2810,30 @@
     <w:p>
       <w:pPr>
         <w:rPr>
-          <w:rFonts w:hint="eastAsia"/>
+          <w:sz w:val="20"/>
+          <w:szCs w:val="24"/>
         </w:rPr>
       </w:pPr>
       <w:r>
+        <w:rPr>
+          <w:sz w:val="20"/>
+          <w:szCs w:val="24"/>
+        </w:rPr>
         <w:t>The classifier uses an ImageNet-pretrained ResNet50 backbone with a replacement final classification layer. Stage 1 validation ran for 25 epochs with batch size 32, learning rate 0.0005 and weight decay 0.0001; the best validation macro-F1 was 95.75% at epoch 20.</w:t>
       </w:r>
     </w:p>
     <w:p>
       <w:pPr>
         <w:rPr>
-          <w:rFonts w:hint="eastAsia"/>
+          <w:sz w:val="20"/>
+          <w:szCs w:val="24"/>
         </w:rPr>
       </w:pPr>
       <w:r>
+        <w:rPr>
+          <w:sz w:val="20"/>
+          <w:szCs w:val="24"/>
+        </w:rPr>
         <w:t>Stage 2 checkpoint metadata records validation macro-F1 of 96.80% at epoch 6 over 19 classes.</w:t>
       </w:r>
     </w:p>
@@ -2082,40 +2848,70 @@
     <w:p>
       <w:pPr>
         <w:rPr>
-          <w:rFonts w:hint="eastAsia"/>
+          <w:sz w:val="20"/>
+          <w:szCs w:val="24"/>
         </w:rPr>
       </w:pPr>
       <w:r>
-        <w:t>The OOD detector normalizes ResNet feature embeddings and compares them with known-class centroids using cosine similarity. The best similarity is compared with a calibrated threshold.</w:t>
+        <w:rPr>
+          <w:sz w:val="20"/>
+          <w:szCs w:val="24"/>
+        </w:rPr>
+        <w:t xml:space="preserve">The OOD detector normalizes </w:t>
+      </w:r>
+      <w:proofErr w:type="spellStart"/>
+      <w:r>
+        <w:rPr>
+          <w:sz w:val="20"/>
+          <w:szCs w:val="24"/>
+        </w:rPr>
+        <w:t>ResNet</w:t>
+      </w:r>
+      <w:proofErr w:type="spellEnd"/>
+      <w:r>
+        <w:rPr>
+          <w:sz w:val="20"/>
+          <w:szCs w:val="24"/>
+        </w:rPr>
+        <w:t xml:space="preserve"> feature embeddings and compares them with known-class centroids using cosine similarity. The best similarity is compared with a calibrated threshold.</w:t>
       </w:r>
     </w:p>
     <w:p>
       <w:pPr>
         <w:rPr>
-          <w:rFonts w:hint="eastAsia"/>
+          <w:sz w:val="20"/>
+          <w:szCs w:val="24"/>
         </w:rPr>
       </w:pPr>
       <w:r>
+        <w:rPr>
+          <w:sz w:val="20"/>
+          <w:szCs w:val="24"/>
+        </w:rPr>
         <w:t>The expanded threshold is 0.230447, calibrated as the 1st percentile of correct-class cosine similarities on the expanded validation set.</w:t>
       </w:r>
     </w:p>
     <w:p>
       <w:pPr>
         <w:rPr>
-          <w:rFonts w:hint="eastAsia"/>
+          <w:sz w:val="20"/>
+          <w:szCs w:val="24"/>
         </w:rPr>
       </w:pPr>
       <w:r>
+        <w:rPr>
+          <w:sz w:val="20"/>
+          <w:szCs w:val="24"/>
+        </w:rPr>
         <w:t>A real rejection example produced similarity 0.1996 against threshold 0.2304, so it was rejected because 0.1996 &lt; 0.2304.</w:t>
       </w:r>
     </w:p>
     <w:p>
-      <w:pPr>
-        <w:rPr>
-          <w:rFonts w:hint="eastAsia"/>
-        </w:rPr>
-      </w:pPr>
       <w:r>
+        <w:rPr>
+          <w:sz w:val="20"/>
+          <w:szCs w:val="24"/>
+        </w:rPr>
         <w:br w:type="page"/>
       </w:r>
     </w:p>
@@ -2131,20 +2927,62 @@
     <w:p>
       <w:pPr>
         <w:rPr>
-          <w:rFonts w:hint="eastAsia"/>
+          <w:sz w:val="20"/>
+          <w:szCs w:val="24"/>
         </w:rPr>
       </w:pPr>
       <w:r>
-        <w:t>OOD rejection alone does not guarantee a semantically consistent result. WasteWise AI therefore checks whether the detailed ResNet prediction is compatible with the practical YOLO detection class.</w:t>
+        <w:rPr>
+          <w:sz w:val="20"/>
+          <w:szCs w:val="24"/>
+        </w:rPr>
+        <w:t xml:space="preserve">OOD rejection alone does not guarantee a semantically consistent result. </w:t>
+      </w:r>
+      <w:proofErr w:type="spellStart"/>
+      <w:r>
+        <w:rPr>
+          <w:sz w:val="20"/>
+          <w:szCs w:val="24"/>
+        </w:rPr>
+        <w:t>WasteWise</w:t>
+      </w:r>
+      <w:proofErr w:type="spellEnd"/>
+      <w:r>
+        <w:rPr>
+          <w:sz w:val="20"/>
+          <w:szCs w:val="24"/>
+        </w:rPr>
+        <w:t xml:space="preserve"> AI therefore checks whether the detailed </w:t>
+      </w:r>
+      <w:proofErr w:type="spellStart"/>
+      <w:r>
+        <w:rPr>
+          <w:sz w:val="20"/>
+          <w:szCs w:val="24"/>
+        </w:rPr>
+        <w:t>ResNet</w:t>
+      </w:r>
+      <w:proofErr w:type="spellEnd"/>
+      <w:r>
+        <w:rPr>
+          <w:sz w:val="20"/>
+          <w:szCs w:val="24"/>
+        </w:rPr>
+        <w:t xml:space="preserve"> prediction is compatible with the practical YOLO detection class.</w:t>
       </w:r>
     </w:p>
     <w:p>
       <w:pPr>
         <w:rPr>
-          <w:rFonts w:hint="eastAsia"/>
+          <w:sz w:val="20"/>
+          <w:szCs w:val="24"/>
         </w:rPr>
       </w:pPr>
       <w:r>
+        <w:rPr>
+          <w:sz w:val="20"/>
+          <w:szCs w:val="24"/>
+        </w:rPr>
         <w:t>The production predictor rejects an object when the OOD detector marks it unsupported or when the classifier output is incompatible with the detector class.</w:t>
       </w:r>
     </w:p>
@@ -2159,30 +2997,45 @@
     <w:p>
       <w:pPr>
         <w:rPr>
-          <w:rFonts w:hint="eastAsia"/>
+          <w:sz w:val="20"/>
+          <w:szCs w:val="24"/>
         </w:rPr>
       </w:pPr>
       <w:r>
+        <w:rPr>
+          <w:sz w:val="20"/>
+          <w:szCs w:val="24"/>
+        </w:rPr>
         <w:t>The production accounting logic explicitly maintains:</w:t>
       </w:r>
     </w:p>
     <w:p>
       <w:pPr>
         <w:rPr>
-          <w:rFonts w:hint="eastAsia"/>
+          <w:sz w:val="20"/>
+          <w:szCs w:val="24"/>
         </w:rPr>
       </w:pPr>
       <w:r>
+        <w:rPr>
+          <w:sz w:val="20"/>
+          <w:szCs w:val="24"/>
+        </w:rPr>
         <w:t>RAW DETECTIONS = ACCEPTED + OOD REJECTED + COMPATIBILITY REJECTED + OTHER REJECTED</w:t>
       </w:r>
     </w:p>
     <w:p>
       <w:pPr>
         <w:rPr>
-          <w:rFonts w:hint="eastAsia"/>
+          <w:sz w:val="20"/>
+          <w:szCs w:val="24"/>
         </w:rPr>
       </w:pPr>
       <w:r>
+        <w:rPr>
+          <w:sz w:val="20"/>
+          <w:szCs w:val="24"/>
+        </w:rPr>
         <w:t>The detector confidence default is 0.35, while the expanded OOD calibration file supplies the OOD threshold.</w:t>
       </w:r>
     </w:p>
@@ -2197,10 +3050,15 @@
     <w:p>
       <w:pPr>
         <w:rPr>
-          <w:rFonts w:hint="eastAsia"/>
+          <w:sz w:val="20"/>
+          <w:szCs w:val="24"/>
         </w:rPr>
       </w:pPr>
       <w:r>
+        <w:rPr>
+          <w:sz w:val="20"/>
+          <w:szCs w:val="24"/>
+        </w:rPr>
         <w:t>The external evaluation discovered 6,321 images. After taxonomy filtering, 6,249 supported images were evaluated and 72 were excluded. There were 6,195 correct predictions, 54 incorrect predictions, and zero inference errors.</w:t>
       </w:r>
     </w:p>
@@ -2228,12 +3086,15 @@
           <w:p>
             <w:pPr>
               <w:rPr>
-                <w:rFonts w:hint="eastAsia"/>
+                <w:sz w:val="20"/>
+                <w:szCs w:val="24"/>
               </w:rPr>
             </w:pPr>
             <w:r>
               <w:rPr>
                 <w:b/>
+                <w:sz w:val="20"/>
+                <w:szCs w:val="24"/>
               </w:rPr>
               <w:t>Measure</w:t>
             </w:r>
@@ -2248,12 +3109,15 @@
           <w:p>
             <w:pPr>
               <w:rPr>
-                <w:rFonts w:hint="eastAsia"/>
+                <w:sz w:val="20"/>
+                <w:szCs w:val="24"/>
               </w:rPr>
             </w:pPr>
             <w:r>
               <w:rPr>
                 <w:b/>
+                <w:sz w:val="20"/>
+                <w:szCs w:val="24"/>
               </w:rPr>
               <w:t>Result</w:t>
             </w:r>
@@ -2272,10 +3136,15 @@
           <w:p>
             <w:pPr>
               <w:rPr>
-                <w:rFonts w:hint="eastAsia"/>
+                <w:sz w:val="20"/>
+                <w:szCs w:val="24"/>
               </w:rPr>
             </w:pPr>
             <w:r>
+              <w:rPr>
+                <w:sz w:val="20"/>
+                <w:szCs w:val="24"/>
+              </w:rPr>
               <w:t>Total discovered</w:t>
             </w:r>
           </w:p>
@@ -2288,10 +3157,15 @@
           <w:p>
             <w:pPr>
               <w:rPr>
-                <w:rFonts w:hint="eastAsia"/>
+                <w:sz w:val="20"/>
+                <w:szCs w:val="24"/>
               </w:rPr>
             </w:pPr>
             <w:r>
+              <w:rPr>
+                <w:sz w:val="20"/>
+                <w:szCs w:val="24"/>
+              </w:rPr>
               <w:t>6,321</w:t>
             </w:r>
           </w:p>
@@ -2309,10 +3183,15 @@
           <w:p>
             <w:pPr>
               <w:rPr>
-                <w:rFonts w:hint="eastAsia"/>
+                <w:sz w:val="20"/>
+                <w:szCs w:val="24"/>
               </w:rPr>
             </w:pPr>
             <w:r>
+              <w:rPr>
+                <w:sz w:val="20"/>
+                <w:szCs w:val="24"/>
+              </w:rPr>
               <w:t>Supported/evaluated</w:t>
             </w:r>
           </w:p>
@@ -2325,10 +3204,15 @@
           <w:p>
             <w:pPr>
               <w:rPr>
-                <w:rFonts w:hint="eastAsia"/>
+                <w:sz w:val="20"/>
+                <w:szCs w:val="24"/>
               </w:rPr>
             </w:pPr>
             <w:r>
+              <w:rPr>
+                <w:sz w:val="20"/>
+                <w:szCs w:val="24"/>
+              </w:rPr>
               <w:t>6,249</w:t>
             </w:r>
           </w:p>
@@ -2346,10 +3230,15 @@
           <w:p>
             <w:pPr>
               <w:rPr>
-                <w:rFonts w:hint="eastAsia"/>
+                <w:sz w:val="20"/>
+                <w:szCs w:val="24"/>
               </w:rPr>
             </w:pPr>
             <w:r>
+              <w:rPr>
+                <w:sz w:val="20"/>
+                <w:szCs w:val="24"/>
+              </w:rPr>
               <w:t>Unsupported/excluded</w:t>
             </w:r>
           </w:p>
@@ -2362,10 +3251,15 @@
           <w:p>
             <w:pPr>
               <w:rPr>
-                <w:rFonts w:hint="eastAsia"/>
+                <w:sz w:val="20"/>
+                <w:szCs w:val="24"/>
               </w:rPr>
             </w:pPr>
             <w:r>
+              <w:rPr>
+                <w:sz w:val="20"/>
+                <w:szCs w:val="24"/>
+              </w:rPr>
               <w:t>72</w:t>
             </w:r>
           </w:p>
@@ -2383,10 +3277,15 @@
           <w:p>
             <w:pPr>
               <w:rPr>
-                <w:rFonts w:hint="eastAsia"/>
+                <w:sz w:val="20"/>
+                <w:szCs w:val="24"/>
               </w:rPr>
             </w:pPr>
             <w:r>
+              <w:rPr>
+                <w:sz w:val="20"/>
+                <w:szCs w:val="24"/>
+              </w:rPr>
               <w:t>Correct</w:t>
             </w:r>
           </w:p>
@@ -2399,10 +3298,15 @@
           <w:p>
             <w:pPr>
               <w:rPr>
-                <w:rFonts w:hint="eastAsia"/>
+                <w:sz w:val="20"/>
+                <w:szCs w:val="24"/>
               </w:rPr>
             </w:pPr>
             <w:r>
+              <w:rPr>
+                <w:sz w:val="20"/>
+                <w:szCs w:val="24"/>
+              </w:rPr>
               <w:t>6,195</w:t>
             </w:r>
           </w:p>
@@ -2420,10 +3324,15 @@
           <w:p>
             <w:pPr>
               <w:rPr>
-                <w:rFonts w:hint="eastAsia"/>
+                <w:sz w:val="20"/>
+                <w:szCs w:val="24"/>
               </w:rPr>
             </w:pPr>
             <w:r>
+              <w:rPr>
+                <w:sz w:val="20"/>
+                <w:szCs w:val="24"/>
+              </w:rPr>
               <w:t>Incorrect</w:t>
             </w:r>
           </w:p>
@@ -2436,10 +3345,15 @@
           <w:p>
             <w:pPr>
               <w:rPr>
-                <w:rFonts w:hint="eastAsia"/>
+                <w:sz w:val="20"/>
+                <w:szCs w:val="24"/>
               </w:rPr>
             </w:pPr>
             <w:r>
+              <w:rPr>
+                <w:sz w:val="20"/>
+                <w:szCs w:val="24"/>
+              </w:rPr>
               <w:t>54</w:t>
             </w:r>
           </w:p>
@@ -2457,10 +3371,15 @@
           <w:p>
             <w:pPr>
               <w:rPr>
-                <w:rFonts w:hint="eastAsia"/>
+                <w:sz w:val="20"/>
+                <w:szCs w:val="24"/>
               </w:rPr>
             </w:pPr>
             <w:r>
+              <w:rPr>
+                <w:sz w:val="20"/>
+                <w:szCs w:val="24"/>
+              </w:rPr>
               <w:t>Inference errors</w:t>
             </w:r>
           </w:p>
@@ -2473,10 +3392,15 @@
           <w:p>
             <w:pPr>
               <w:rPr>
-                <w:rFonts w:hint="eastAsia"/>
+                <w:sz w:val="20"/>
+                <w:szCs w:val="24"/>
               </w:rPr>
             </w:pPr>
             <w:r>
+              <w:rPr>
+                <w:sz w:val="20"/>
+                <w:szCs w:val="24"/>
+              </w:rPr>
               <w:t>0</w:t>
             </w:r>
           </w:p>
@@ -2494,10 +3418,15 @@
           <w:p>
             <w:pPr>
               <w:rPr>
-                <w:rFonts w:hint="eastAsia"/>
+                <w:sz w:val="20"/>
+                <w:szCs w:val="24"/>
               </w:rPr>
             </w:pPr>
             <w:r>
+              <w:rPr>
+                <w:sz w:val="20"/>
+                <w:szCs w:val="24"/>
+              </w:rPr>
               <w:t>Accuracy on supported subset</w:t>
             </w:r>
           </w:p>
@@ -2510,10 +3439,15 @@
           <w:p>
             <w:pPr>
               <w:rPr>
-                <w:rFonts w:hint="eastAsia"/>
+                <w:sz w:val="20"/>
+                <w:szCs w:val="24"/>
               </w:rPr>
             </w:pPr>
             <w:r>
+              <w:rPr>
+                <w:sz w:val="20"/>
+                <w:szCs w:val="24"/>
+              </w:rPr>
               <w:t>99.14%</w:t>
             </w:r>
           </w:p>
@@ -2522,7 +3456,7 @@
     </w:tbl>
     <w:p>
       <w:pPr>
-        <w:pStyle w:val="Heading2"/>
+        <w:pStyle w:val="Heading1"/>
       </w:pPr>
       <w:r>
         <w:t>16. Per-Class External Results</w:t>
@@ -2553,12 +3487,15 @@
           <w:p>
             <w:pPr>
               <w:rPr>
-                <w:rFonts w:hint="eastAsia"/>
+                <w:sz w:val="20"/>
+                <w:szCs w:val="24"/>
               </w:rPr>
             </w:pPr>
             <w:r>
               <w:rPr>
                 <w:b/>
+                <w:sz w:val="20"/>
+                <w:szCs w:val="24"/>
               </w:rPr>
               <w:t>Class</w:t>
             </w:r>
@@ -2573,12 +3510,15 @@
           <w:p>
             <w:pPr>
               <w:rPr>
-                <w:rFonts w:hint="eastAsia"/>
+                <w:sz w:val="20"/>
+                <w:szCs w:val="24"/>
               </w:rPr>
             </w:pPr>
             <w:r>
               <w:rPr>
                 <w:b/>
+                <w:sz w:val="20"/>
+                <w:szCs w:val="24"/>
               </w:rPr>
               <w:t>Correct / Total</w:t>
             </w:r>
@@ -2593,12 +3533,15 @@
           <w:p>
             <w:pPr>
               <w:rPr>
-                <w:rFonts w:hint="eastAsia"/>
+                <w:sz w:val="20"/>
+                <w:szCs w:val="24"/>
               </w:rPr>
             </w:pPr>
             <w:r>
               <w:rPr>
                 <w:b/>
+                <w:sz w:val="20"/>
+                <w:szCs w:val="24"/>
               </w:rPr>
               <w:t>Accuracy</w:t>
             </w:r>
@@ -2617,10 +3560,15 @@
           <w:p>
             <w:pPr>
               <w:rPr>
-                <w:rFonts w:hint="eastAsia"/>
+                <w:sz w:val="20"/>
+                <w:szCs w:val="24"/>
               </w:rPr>
             </w:pPr>
             <w:r>
+              <w:rPr>
+                <w:sz w:val="20"/>
+                <w:szCs w:val="24"/>
+              </w:rPr>
               <w:t>gauze</w:t>
             </w:r>
           </w:p>
@@ -2633,10 +3581,15 @@
           <w:p>
             <w:pPr>
               <w:rPr>
-                <w:rFonts w:hint="eastAsia"/>
+                <w:sz w:val="20"/>
+                <w:szCs w:val="24"/>
               </w:rPr>
             </w:pPr>
             <w:r>
+              <w:rPr>
+                <w:sz w:val="20"/>
+                <w:szCs w:val="24"/>
+              </w:rPr>
               <w:t>600 / 630</w:t>
             </w:r>
           </w:p>
@@ -2649,10 +3602,15 @@
           <w:p>
             <w:pPr>
               <w:rPr>
-                <w:rFonts w:hint="eastAsia"/>
+                <w:sz w:val="20"/>
+                <w:szCs w:val="24"/>
               </w:rPr>
             </w:pPr>
             <w:r>
+              <w:rPr>
+                <w:sz w:val="20"/>
+                <w:szCs w:val="24"/>
+              </w:rPr>
               <w:t>95.24%</w:t>
             </w:r>
           </w:p>
@@ -2670,12 +3628,19 @@
           <w:p>
             <w:pPr>
               <w:rPr>
-                <w:rFonts w:hint="eastAsia"/>
+                <w:sz w:val="20"/>
+                <w:szCs w:val="24"/>
               </w:rPr>
             </w:pPr>
+            <w:proofErr w:type="spellStart"/>
             <w:r>
+              <w:rPr>
+                <w:sz w:val="20"/>
+                <w:szCs w:val="24"/>
+              </w:rPr>
               <w:t>medical_cap</w:t>
             </w:r>
+            <w:proofErr w:type="spellEnd"/>
           </w:p>
         </w:tc>
         <w:tc>
@@ -2686,10 +3651,15 @@
           <w:p>
             <w:pPr>
               <w:rPr>
-                <w:rFonts w:hint="eastAsia"/>
+                <w:sz w:val="20"/>
+                <w:szCs w:val="24"/>
               </w:rPr>
             </w:pPr>
             <w:r>
+              <w:rPr>
+                <w:sz w:val="20"/>
+                <w:szCs w:val="24"/>
+              </w:rPr>
               <w:t>438 / 438</w:t>
             </w:r>
           </w:p>
@@ -2702,10 +3672,15 @@
           <w:p>
             <w:pPr>
               <w:rPr>
-                <w:rFonts w:hint="eastAsia"/>
+                <w:sz w:val="20"/>
+                <w:szCs w:val="24"/>
               </w:rPr>
             </w:pPr>
             <w:r>
+              <w:rPr>
+                <w:sz w:val="20"/>
+                <w:szCs w:val="24"/>
+              </w:rPr>
               <w:t>100%</w:t>
             </w:r>
           </w:p>
@@ -2723,12 +3698,19 @@
           <w:p>
             <w:pPr>
               <w:rPr>
-                <w:rFonts w:hint="eastAsia"/>
+                <w:sz w:val="20"/>
+                <w:szCs w:val="24"/>
               </w:rPr>
             </w:pPr>
+            <w:proofErr w:type="spellStart"/>
             <w:r>
+              <w:rPr>
+                <w:sz w:val="20"/>
+                <w:szCs w:val="24"/>
+              </w:rPr>
               <w:t>medical_glasses</w:t>
             </w:r>
+            <w:proofErr w:type="spellEnd"/>
           </w:p>
         </w:tc>
         <w:tc>
@@ -2739,10 +3721,15 @@
           <w:p>
             <w:pPr>
               <w:rPr>
-                <w:rFonts w:hint="eastAsia"/>
+                <w:sz w:val="20"/>
+                <w:szCs w:val="24"/>
               </w:rPr>
             </w:pPr>
             <w:r>
+              <w:rPr>
+                <w:sz w:val="20"/>
+                <w:szCs w:val="24"/>
+              </w:rPr>
               <w:t>486 / 486</w:t>
             </w:r>
           </w:p>
@@ -2755,10 +3742,15 @@
           <w:p>
             <w:pPr>
               <w:rPr>
-                <w:rFonts w:hint="eastAsia"/>
+                <w:sz w:val="20"/>
+                <w:szCs w:val="24"/>
               </w:rPr>
             </w:pPr>
             <w:r>
+              <w:rPr>
+                <w:sz w:val="20"/>
+                <w:szCs w:val="24"/>
+              </w:rPr>
               <w:t>100%</w:t>
             </w:r>
           </w:p>
@@ -2776,12 +3768,19 @@
           <w:p>
             <w:pPr>
               <w:rPr>
-                <w:rFonts w:hint="eastAsia"/>
+                <w:sz w:val="20"/>
+                <w:szCs w:val="24"/>
               </w:rPr>
             </w:pPr>
+            <w:proofErr w:type="spellStart"/>
             <w:r>
+              <w:rPr>
+                <w:sz w:val="20"/>
+                <w:szCs w:val="24"/>
+              </w:rPr>
               <w:t>medical_gloves</w:t>
             </w:r>
+            <w:proofErr w:type="spellEnd"/>
           </w:p>
         </w:tc>
         <w:tc>
@@ -2792,10 +3791,15 @@
           <w:p>
             <w:pPr>
               <w:rPr>
-                <w:rFonts w:hint="eastAsia"/>
+                <w:sz w:val="20"/>
+                <w:szCs w:val="24"/>
               </w:rPr>
             </w:pPr>
             <w:r>
+              <w:rPr>
+                <w:sz w:val="20"/>
+                <w:szCs w:val="24"/>
+              </w:rPr>
               <w:t>2,764 / 2,787</w:t>
             </w:r>
           </w:p>
@@ -2808,10 +3812,15 @@
           <w:p>
             <w:pPr>
               <w:rPr>
-                <w:rFonts w:hint="eastAsia"/>
+                <w:sz w:val="20"/>
+                <w:szCs w:val="24"/>
               </w:rPr>
             </w:pPr>
             <w:r>
+              <w:rPr>
+                <w:sz w:val="20"/>
+                <w:szCs w:val="24"/>
+              </w:rPr>
               <w:t>99.17%</w:t>
             </w:r>
           </w:p>
@@ -2829,12 +3838,19 @@
           <w:p>
             <w:pPr>
               <w:rPr>
-                <w:rFonts w:hint="eastAsia"/>
+                <w:sz w:val="20"/>
+                <w:szCs w:val="24"/>
               </w:rPr>
             </w:pPr>
+            <w:proofErr w:type="spellStart"/>
             <w:r>
+              <w:rPr>
+                <w:sz w:val="20"/>
+                <w:szCs w:val="24"/>
+              </w:rPr>
               <w:t>shoe_cover</w:t>
             </w:r>
+            <w:proofErr w:type="spellEnd"/>
           </w:p>
         </w:tc>
         <w:tc>
@@ -2845,10 +3861,15 @@
           <w:p>
             <w:pPr>
               <w:rPr>
-                <w:rFonts w:hint="eastAsia"/>
+                <w:sz w:val="20"/>
+                <w:szCs w:val="24"/>
               </w:rPr>
             </w:pPr>
             <w:r>
+              <w:rPr>
+                <w:sz w:val="20"/>
+                <w:szCs w:val="24"/>
+              </w:rPr>
               <w:t>972 / 972</w:t>
             </w:r>
           </w:p>
@@ -2861,10 +3882,15 @@
           <w:p>
             <w:pPr>
               <w:rPr>
-                <w:rFonts w:hint="eastAsia"/>
+                <w:sz w:val="20"/>
+                <w:szCs w:val="24"/>
               </w:rPr>
             </w:pPr>
             <w:r>
+              <w:rPr>
+                <w:sz w:val="20"/>
+                <w:szCs w:val="24"/>
+              </w:rPr>
               <w:t>100%</w:t>
             </w:r>
           </w:p>
@@ -2882,12 +3908,19 @@
           <w:p>
             <w:pPr>
               <w:rPr>
-                <w:rFonts w:hint="eastAsia"/>
+                <w:sz w:val="20"/>
+                <w:szCs w:val="24"/>
               </w:rPr>
             </w:pPr>
+            <w:proofErr w:type="spellStart"/>
             <w:r>
+              <w:rPr>
+                <w:sz w:val="20"/>
+                <w:szCs w:val="24"/>
+              </w:rPr>
               <w:t>test_tube</w:t>
             </w:r>
+            <w:proofErr w:type="spellEnd"/>
           </w:p>
         </w:tc>
         <w:tc>
@@ -2898,10 +3931,15 @@
           <w:p>
             <w:pPr>
               <w:rPr>
-                <w:rFonts w:hint="eastAsia"/>
+                <w:sz w:val="20"/>
+                <w:szCs w:val="24"/>
               </w:rPr>
             </w:pPr>
             <w:r>
+              <w:rPr>
+                <w:sz w:val="20"/>
+                <w:szCs w:val="24"/>
+              </w:rPr>
               <w:t>482 / 483</w:t>
             </w:r>
           </w:p>
@@ -2914,10 +3952,15 @@
           <w:p>
             <w:pPr>
               <w:rPr>
-                <w:rFonts w:hint="eastAsia"/>
+                <w:sz w:val="20"/>
+                <w:szCs w:val="24"/>
               </w:rPr>
             </w:pPr>
             <w:r>
+              <w:rPr>
+                <w:sz w:val="20"/>
+                <w:szCs w:val="24"/>
+              </w:rPr>
               <w:t>99.79%</w:t>
             </w:r>
           </w:p>
@@ -2935,12 +3978,19 @@
           <w:p>
             <w:pPr>
               <w:rPr>
-                <w:rFonts w:hint="eastAsia"/>
+                <w:sz w:val="20"/>
+                <w:szCs w:val="24"/>
               </w:rPr>
             </w:pPr>
+            <w:proofErr w:type="spellStart"/>
             <w:r>
+              <w:rPr>
+                <w:sz w:val="20"/>
+                <w:szCs w:val="24"/>
+              </w:rPr>
               <w:t>urine_bag</w:t>
             </w:r>
+            <w:proofErr w:type="spellEnd"/>
           </w:p>
         </w:tc>
         <w:tc>
@@ -2951,10 +4001,15 @@
           <w:p>
             <w:pPr>
               <w:rPr>
-                <w:rFonts w:hint="eastAsia"/>
+                <w:sz w:val="20"/>
+                <w:szCs w:val="24"/>
               </w:rPr>
             </w:pPr>
             <w:r>
+              <w:rPr>
+                <w:sz w:val="20"/>
+                <w:szCs w:val="24"/>
+              </w:rPr>
               <w:t>453 / 453</w:t>
             </w:r>
           </w:p>
@@ -2967,10 +4022,15 @@
           <w:p>
             <w:pPr>
               <w:rPr>
-                <w:rFonts w:hint="eastAsia"/>
+                <w:sz w:val="20"/>
+                <w:szCs w:val="24"/>
               </w:rPr>
             </w:pPr>
             <w:r>
+              <w:rPr>
+                <w:sz w:val="20"/>
+                <w:szCs w:val="24"/>
+              </w:rPr>
               <w:t>100%</w:t>
             </w:r>
           </w:p>
@@ -2980,19 +4040,19 @@
     <w:p>
       <w:pPr>
         <w:rPr>
-          <w:rFonts w:hint="eastAsia"/>
+          <w:sz w:val="20"/>
+          <w:szCs w:val="24"/>
         </w:rPr>
       </w:pPr>
       <w:r>
+        <w:rPr>
+          <w:sz w:val="20"/>
+          <w:szCs w:val="24"/>
+        </w:rPr>
         <w:t>Correct interpretation: on the supported subset of the Medical Waste 4.0 external dataset, the Expanded ResNet50 Stage 2 achieved 99.14% classification accuracy. This is not end-to-end detector accuracy.</w:t>
       </w:r>
     </w:p>
     <w:p>
-      <w:pPr>
-        <w:rPr>
-          <w:rFonts w:hint="eastAsia"/>
-        </w:rPr>
-      </w:pPr>
       <w:r>
         <w:br w:type="page"/>
       </w:r>
@@ -3009,20 +4069,46 @@
     <w:p>
       <w:pPr>
         <w:rPr>
-          <w:rFonts w:hint="eastAsia"/>
+          <w:sz w:val="20"/>
+          <w:szCs w:val="24"/>
         </w:rPr>
       </w:pPr>
       <w:r>
-        <w:t>The system uses a React/TypeScript frontend and FastAPI inference backend. The backend provides GET /, GET /health, GET /ready and POST /predict.</w:t>
+        <w:rPr>
+          <w:sz w:val="20"/>
+          <w:szCs w:val="24"/>
+        </w:rPr>
+        <w:t xml:space="preserve">The system uses a React/TypeScript frontend and </w:t>
+      </w:r>
+      <w:proofErr w:type="spellStart"/>
+      <w:r>
+        <w:rPr>
+          <w:sz w:val="20"/>
+          <w:szCs w:val="24"/>
+        </w:rPr>
+        <w:t>FastAPI</w:t>
+      </w:r>
+      <w:proofErr w:type="spellEnd"/>
+      <w:r>
+        <w:rPr>
+          <w:sz w:val="20"/>
+          <w:szCs w:val="24"/>
+        </w:rPr>
+        <w:t xml:space="preserve"> inference backend. The backend provides GET /, GET /health, GET /ready and POST /predict.</w:t>
       </w:r>
     </w:p>
     <w:p>
       <w:pPr>
         <w:rPr>
-          <w:rFonts w:hint="eastAsia"/>
+          <w:sz w:val="20"/>
+          <w:szCs w:val="24"/>
         </w:rPr>
       </w:pPr>
       <w:r>
+        <w:rPr>
+          <w:sz w:val="20"/>
+          <w:szCs w:val="24"/>
+        </w:rPr>
         <w:t>It validates file extensions, empty files, image integrity and a 25 MB upload limit, initializes/reuses models, performs inference, and returns structured JSON.</w:t>
       </w:r>
     </w:p>
@@ -3050,12 +4136,15 @@
           <w:p>
             <w:pPr>
               <w:rPr>
-                <w:rFonts w:hint="eastAsia"/>
+                <w:sz w:val="20"/>
+                <w:szCs w:val="24"/>
               </w:rPr>
             </w:pPr>
             <w:r>
               <w:rPr>
                 <w:b/>
+                <w:sz w:val="20"/>
+                <w:szCs w:val="24"/>
               </w:rPr>
               <w:t>Layer</w:t>
             </w:r>
@@ -3070,12 +4159,15 @@
           <w:p>
             <w:pPr>
               <w:rPr>
-                <w:rFonts w:hint="eastAsia"/>
+                <w:sz w:val="20"/>
+                <w:szCs w:val="24"/>
               </w:rPr>
             </w:pPr>
             <w:r>
               <w:rPr>
                 <w:b/>
+                <w:sz w:val="20"/>
+                <w:szCs w:val="24"/>
               </w:rPr>
               <w:t>Technology</w:t>
             </w:r>
@@ -3094,10 +4186,15 @@
           <w:p>
             <w:pPr>
               <w:rPr>
-                <w:rFonts w:hint="eastAsia"/>
+                <w:sz w:val="20"/>
+                <w:szCs w:val="24"/>
               </w:rPr>
             </w:pPr>
             <w:r>
+              <w:rPr>
+                <w:sz w:val="20"/>
+                <w:szCs w:val="24"/>
+              </w:rPr>
               <w:t>Frontend</w:t>
             </w:r>
           </w:p>
@@ -3110,10 +4207,15 @@
           <w:p>
             <w:pPr>
               <w:rPr>
-                <w:rFonts w:hint="eastAsia"/>
+                <w:sz w:val="20"/>
+                <w:szCs w:val="24"/>
               </w:rPr>
             </w:pPr>
             <w:r>
+              <w:rPr>
+                <w:sz w:val="20"/>
+                <w:szCs w:val="24"/>
+              </w:rPr>
               <w:t>React 19, TypeScript, Vite 8, Tailwind CSS 4</w:t>
             </w:r>
           </w:p>
@@ -3131,10 +4233,15 @@
           <w:p>
             <w:pPr>
               <w:rPr>
-                <w:rFonts w:hint="eastAsia"/>
+                <w:sz w:val="20"/>
+                <w:szCs w:val="24"/>
               </w:rPr>
             </w:pPr>
             <w:r>
+              <w:rPr>
+                <w:sz w:val="20"/>
+                <w:szCs w:val="24"/>
+              </w:rPr>
               <w:t>UI</w:t>
             </w:r>
           </w:p>
@@ -3147,11 +4254,25 @@
           <w:p>
             <w:pPr>
               <w:rPr>
-                <w:rFonts w:hint="eastAsia"/>
+                <w:sz w:val="20"/>
+                <w:szCs w:val="24"/>
               </w:rPr>
             </w:pPr>
+            <w:proofErr w:type="spellStart"/>
             <w:r>
-              <w:t>lucide-react, motion, recharts, lenis</w:t>
+              <w:rPr>
+                <w:sz w:val="20"/>
+                <w:szCs w:val="24"/>
+              </w:rPr>
+              <w:t>lucide</w:t>
+            </w:r>
+            <w:proofErr w:type="spellEnd"/>
+            <w:r>
+              <w:rPr>
+                <w:sz w:val="20"/>
+                <w:szCs w:val="24"/>
+              </w:rPr>
+              <w:t>-react, motion, recharts, lenis</w:t>
             </w:r>
           </w:p>
         </w:tc>
@@ -3168,10 +4289,15 @@
           <w:p>
             <w:pPr>
               <w:rPr>
-                <w:rFonts w:hint="eastAsia"/>
+                <w:sz w:val="20"/>
+                <w:szCs w:val="24"/>
               </w:rPr>
             </w:pPr>
             <w:r>
+              <w:rPr>
+                <w:sz w:val="20"/>
+                <w:szCs w:val="24"/>
+              </w:rPr>
               <w:t>Backend</w:t>
             </w:r>
           </w:p>
@@ -3184,12 +4310,19 @@
           <w:p>
             <w:pPr>
               <w:rPr>
-                <w:rFonts w:hint="eastAsia"/>
+                <w:sz w:val="20"/>
+                <w:szCs w:val="24"/>
               </w:rPr>
             </w:pPr>
+            <w:proofErr w:type="spellStart"/>
             <w:r>
+              <w:rPr>
+                <w:sz w:val="20"/>
+                <w:szCs w:val="24"/>
+              </w:rPr>
               <w:t>FastAPI</w:t>
             </w:r>
+            <w:proofErr w:type="spellEnd"/>
           </w:p>
         </w:tc>
       </w:tr>
@@ -3205,10 +4338,15 @@
           <w:p>
             <w:pPr>
               <w:rPr>
-                <w:rFonts w:hint="eastAsia"/>
+                <w:sz w:val="20"/>
+                <w:szCs w:val="24"/>
               </w:rPr>
             </w:pPr>
             <w:r>
+              <w:rPr>
+                <w:sz w:val="20"/>
+                <w:szCs w:val="24"/>
+              </w:rPr>
               <w:t>Detector</w:t>
             </w:r>
           </w:p>
@@ -3221,10 +4359,15 @@
           <w:p>
             <w:pPr>
               <w:rPr>
-                <w:rFonts w:hint="eastAsia"/>
+                <w:sz w:val="20"/>
+                <w:szCs w:val="24"/>
               </w:rPr>
             </w:pPr>
             <w:r>
+              <w:rPr>
+                <w:sz w:val="20"/>
+                <w:szCs w:val="24"/>
+              </w:rPr>
               <w:t>YOLO11s</w:t>
             </w:r>
           </w:p>
@@ -3242,10 +4385,15 @@
           <w:p>
             <w:pPr>
               <w:rPr>
-                <w:rFonts w:hint="eastAsia"/>
+                <w:sz w:val="20"/>
+                <w:szCs w:val="24"/>
               </w:rPr>
             </w:pPr>
             <w:r>
+              <w:rPr>
+                <w:sz w:val="20"/>
+                <w:szCs w:val="24"/>
+              </w:rPr>
               <w:t>Classifier</w:t>
             </w:r>
           </w:p>
@@ -3258,10 +4406,15 @@
           <w:p>
             <w:pPr>
               <w:rPr>
-                <w:rFonts w:hint="eastAsia"/>
+                <w:sz w:val="20"/>
+                <w:szCs w:val="24"/>
               </w:rPr>
             </w:pPr>
             <w:r>
+              <w:rPr>
+                <w:sz w:val="20"/>
+                <w:szCs w:val="24"/>
+              </w:rPr>
               <w:t>ImageNet-pretrained ResNet50</w:t>
             </w:r>
           </w:p>
@@ -3279,10 +4432,15 @@
           <w:p>
             <w:pPr>
               <w:rPr>
-                <w:rFonts w:hint="eastAsia"/>
+                <w:sz w:val="20"/>
+                <w:szCs w:val="24"/>
               </w:rPr>
             </w:pPr>
             <w:r>
+              <w:rPr>
+                <w:sz w:val="20"/>
+                <w:szCs w:val="24"/>
+              </w:rPr>
               <w:t>OOD</w:t>
             </w:r>
           </w:p>
@@ -3295,10 +4453,15 @@
           <w:p>
             <w:pPr>
               <w:rPr>
-                <w:rFonts w:hint="eastAsia"/>
+                <w:sz w:val="20"/>
+                <w:szCs w:val="24"/>
               </w:rPr>
             </w:pPr>
             <w:r>
+              <w:rPr>
+                <w:sz w:val="20"/>
+                <w:szCs w:val="24"/>
+              </w:rPr>
               <w:t>Centroids + cosine similarity</w:t>
             </w:r>
           </w:p>
@@ -3316,10 +4479,15 @@
           <w:p>
             <w:pPr>
               <w:rPr>
-                <w:rFonts w:hint="eastAsia"/>
+                <w:sz w:val="20"/>
+                <w:szCs w:val="24"/>
               </w:rPr>
             </w:pPr>
             <w:r>
+              <w:rPr>
+                <w:sz w:val="20"/>
+                <w:szCs w:val="24"/>
+              </w:rPr>
               <w:t>API</w:t>
             </w:r>
           </w:p>
@@ -3332,10 +4500,15 @@
           <w:p>
             <w:pPr>
               <w:rPr>
-                <w:rFonts w:hint="eastAsia"/>
+                <w:sz w:val="20"/>
+                <w:szCs w:val="24"/>
               </w:rPr>
             </w:pPr>
             <w:r>
+              <w:rPr>
+                <w:sz w:val="20"/>
+                <w:szCs w:val="24"/>
+              </w:rPr>
               <w:t>/, /health, /ready, /predict</w:t>
             </w:r>
           </w:p>
@@ -3353,21 +4526,63 @@
     <w:p>
       <w:pPr>
         <w:rPr>
-          <w:rFonts w:hint="eastAsia"/>
+          <w:sz w:val="20"/>
+          <w:szCs w:val="24"/>
         </w:rPr>
       </w:pPr>
       <w:r>
-        <w:t>For plastic_42.jpg, production inference produced 10 raw detections and 2 accepted detections, with approximately 1,194.64 ms inference time.</w:t>
+        <w:rPr>
+          <w:sz w:val="20"/>
+          <w:szCs w:val="24"/>
+        </w:rPr>
+        <w:t xml:space="preserve">For plastic_42.jpg, production inference produced 10 raw detections and 2 accepted detections, with approximately 1,194.64 </w:t>
+      </w:r>
+      <w:proofErr w:type="spellStart"/>
+      <w:r>
+        <w:rPr>
+          <w:sz w:val="20"/>
+          <w:szCs w:val="24"/>
+        </w:rPr>
+        <w:t>ms</w:t>
+      </w:r>
+      <w:proofErr w:type="spellEnd"/>
+      <w:r>
+        <w:rPr>
+          <w:sz w:val="20"/>
+          <w:szCs w:val="24"/>
+        </w:rPr>
+        <w:t xml:space="preserve"> inference time.</w:t>
       </w:r>
     </w:p>
     <w:p>
       <w:pPr>
         <w:rPr>
-          <w:rFonts w:hint="eastAsia"/>
+          <w:sz w:val="20"/>
+          <w:szCs w:val="24"/>
         </w:rPr>
       </w:pPr>
       <w:r>
-        <w:t>Rejected examples included a detector-plastic result classified as general_trash with OOD similarity 0.3276 and another with no accepted classifier class and OOD similarity 0.1529.</w:t>
+        <w:rPr>
+          <w:sz w:val="20"/>
+          <w:szCs w:val="24"/>
+        </w:rPr>
+        <w:t xml:space="preserve">Rejected examples included a detector-plastic result classified as </w:t>
+      </w:r>
+      <w:proofErr w:type="spellStart"/>
+      <w:r>
+        <w:rPr>
+          <w:sz w:val="20"/>
+          <w:szCs w:val="24"/>
+        </w:rPr>
+        <w:t>general_trash</w:t>
+      </w:r>
+      <w:proofErr w:type="spellEnd"/>
+      <w:r>
+        <w:rPr>
+          <w:sz w:val="20"/>
+          <w:szCs w:val="24"/>
+        </w:rPr>
+        <w:t xml:space="preserve"> with OOD similarity 0.3276 and another with no accepted classifier class and OOD similarity 0.1529.</w:t>
       </w:r>
     </w:p>
     <w:p>
@@ -3381,10 +4596,15 @@
     <w:p>
       <w:pPr>
         <w:rPr>
-          <w:rFonts w:hint="eastAsia"/>
+          <w:sz w:val="20"/>
+          <w:szCs w:val="24"/>
         </w:rPr>
       </w:pPr>
       <w:r>
+        <w:rPr>
+          <w:sz w:val="20"/>
+          <w:szCs w:val="24"/>
+        </w:rPr>
         <w:t>Accepted predictions are mapped to disposal categories and recommendations. The guidance layer operates downstream of model acceptance so unsupported or incompatible objects are not automatically converted into disposal advice.</w:t>
       </w:r>
     </w:p>
@@ -3400,10 +4620,15 @@
       <w:pPr>
         <w:pStyle w:val="ListBullet"/>
         <w:rPr>
-          <w:rFonts w:hint="eastAsia"/>
+          <w:sz w:val="20"/>
+          <w:szCs w:val="24"/>
         </w:rPr>
       </w:pPr>
       <w:r>
+        <w:rPr>
+          <w:sz w:val="20"/>
+          <w:szCs w:val="24"/>
+        </w:rPr>
         <w:t>Model checkpoints for baseline and ResNet50 Stage 1/Stage 2 variants.</w:t>
       </w:r>
     </w:p>
@@ -3411,10 +4636,15 @@
       <w:pPr>
         <w:pStyle w:val="ListBullet"/>
         <w:rPr>
-          <w:rFonts w:hint="eastAsia"/>
+          <w:sz w:val="20"/>
+          <w:szCs w:val="24"/>
         </w:rPr>
       </w:pPr>
       <w:r>
+        <w:rPr>
+          <w:sz w:val="20"/>
+          <w:szCs w:val="24"/>
+        </w:rPr>
         <w:t>Expanded OOD calibration configuration.</w:t>
       </w:r>
     </w:p>
@@ -3422,10 +4652,15 @@
       <w:pPr>
         <w:pStyle w:val="ListBullet"/>
         <w:rPr>
-          <w:rFonts w:hint="eastAsia"/>
+          <w:sz w:val="20"/>
+          <w:szCs w:val="24"/>
         </w:rPr>
       </w:pPr>
       <w:r>
+        <w:rPr>
+          <w:sz w:val="20"/>
+          <w:szCs w:val="24"/>
+        </w:rPr>
         <w:t>Classification reports, confusion matrices and evaluation metrics.</w:t>
       </w:r>
     </w:p>
@@ -3433,10 +4668,15 @@
       <w:pPr>
         <w:pStyle w:val="ListBullet"/>
         <w:rPr>
-          <w:rFonts w:hint="eastAsia"/>
+          <w:sz w:val="20"/>
+          <w:szCs w:val="24"/>
         </w:rPr>
       </w:pPr>
       <w:r>
+        <w:rPr>
+          <w:sz w:val="20"/>
+          <w:szCs w:val="24"/>
+        </w:rPr>
         <w:t>Canonical dataset manifest and integrity/audit outputs.</w:t>
       </w:r>
     </w:p>
@@ -3444,10 +4684,15 @@
       <w:pPr>
         <w:pStyle w:val="ListBullet"/>
         <w:rPr>
-          <w:rFonts w:hint="eastAsia"/>
+          <w:sz w:val="20"/>
+          <w:szCs w:val="24"/>
         </w:rPr>
       </w:pPr>
       <w:r>
+        <w:rPr>
+          <w:sz w:val="20"/>
+          <w:szCs w:val="24"/>
+        </w:rPr>
         <w:t>COCO/TACO annotation audit outputs.</w:t>
       </w:r>
     </w:p>
@@ -3455,10 +4700,15 @@
       <w:pPr>
         <w:pStyle w:val="ListBullet"/>
         <w:rPr>
-          <w:rFonts w:hint="eastAsia"/>
+          <w:sz w:val="20"/>
+          <w:szCs w:val="24"/>
         </w:rPr>
       </w:pPr>
       <w:r>
+        <w:rPr>
+          <w:sz w:val="20"/>
+          <w:szCs w:val="24"/>
+        </w:rPr>
         <w:t>Cross-dataset taxonomy and duplicate-provenance audits.</w:t>
       </w:r>
     </w:p>
@@ -3466,10 +4716,15 @@
       <w:pPr>
         <w:pStyle w:val="ListBullet"/>
         <w:rPr>
-          <w:rFonts w:hint="eastAsia"/>
+          <w:sz w:val="20"/>
+          <w:szCs w:val="24"/>
         </w:rPr>
       </w:pPr>
       <w:r>
+        <w:rPr>
+          <w:sz w:val="20"/>
+          <w:szCs w:val="24"/>
+        </w:rPr>
         <w:t>Integrated evaluation and production inference outputs.</w:t>
       </w:r>
     </w:p>
@@ -3477,20 +4732,39 @@
       <w:pPr>
         <w:pStyle w:val="ListBullet"/>
         <w:rPr>
-          <w:rFonts w:hint="eastAsia"/>
-        </w:rPr>
-      </w:pPr>
+          <w:sz w:val="20"/>
+          <w:szCs w:val="24"/>
+        </w:rPr>
+      </w:pPr>
+      <w:proofErr w:type="spellStart"/>
       <w:r>
-        <w:t>FastAPI backend and React/TypeScript frontend.</w:t>
+        <w:rPr>
+          <w:sz w:val="20"/>
+          <w:szCs w:val="24"/>
+        </w:rPr>
+        <w:t>FastAPI</w:t>
+      </w:r>
+      <w:proofErr w:type="spellEnd"/>
+      <w:r>
+        <w:rPr>
+          <w:sz w:val="20"/>
+          <w:szCs w:val="24"/>
+        </w:rPr>
+        <w:t xml:space="preserve"> backend and React/TypeScript frontend.</w:t>
       </w:r>
     </w:p>
     <w:p>
       <w:pPr>
         <w:rPr>
-          <w:rFonts w:hint="eastAsia"/>
+          <w:sz w:val="20"/>
+          <w:szCs w:val="24"/>
         </w:rPr>
       </w:pPr>
       <w:r>
+        <w:rPr>
+          <w:sz w:val="20"/>
+          <w:szCs w:val="24"/>
+        </w:rPr>
         <w:br w:type="page"/>
       </w:r>
     </w:p>
@@ -3507,10 +4781,15 @@
       <w:pPr>
         <w:pStyle w:val="ListBullet"/>
         <w:rPr>
-          <w:rFonts w:hint="eastAsia"/>
+          <w:sz w:val="20"/>
+          <w:szCs w:val="24"/>
         </w:rPr>
       </w:pPr>
       <w:r>
+        <w:rPr>
+          <w:sz w:val="20"/>
+          <w:szCs w:val="24"/>
+        </w:rPr>
         <w:t>Combines localization, classification and rejection logic.</w:t>
       </w:r>
     </w:p>
@@ -3518,10 +4797,15 @@
       <w:pPr>
         <w:pStyle w:val="ListBullet"/>
         <w:rPr>
-          <w:rFonts w:hint="eastAsia"/>
+          <w:sz w:val="20"/>
+          <w:szCs w:val="24"/>
         </w:rPr>
       </w:pPr>
       <w:r>
+        <w:rPr>
+          <w:sz w:val="20"/>
+          <w:szCs w:val="24"/>
+        </w:rPr>
         <w:t>Supports six practical detector classes and 19 detailed classifier classes.</w:t>
       </w:r>
     </w:p>
@@ -3529,10 +4813,15 @@
       <w:pPr>
         <w:pStyle w:val="ListBullet"/>
         <w:rPr>
-          <w:rFonts w:hint="eastAsia"/>
+          <w:sz w:val="20"/>
+          <w:szCs w:val="24"/>
         </w:rPr>
       </w:pPr>
       <w:r>
+        <w:rPr>
+          <w:sz w:val="20"/>
+          <w:szCs w:val="24"/>
+        </w:rPr>
         <w:t>Includes calibrated OOD rejection.</w:t>
       </w:r>
     </w:p>
@@ -3540,10 +4829,15 @@
       <w:pPr>
         <w:pStyle w:val="ListBullet"/>
         <w:rPr>
-          <w:rFonts w:hint="eastAsia"/>
+          <w:sz w:val="20"/>
+          <w:szCs w:val="24"/>
         </w:rPr>
       </w:pPr>
       <w:r>
+        <w:rPr>
+          <w:sz w:val="20"/>
+          <w:szCs w:val="24"/>
+        </w:rPr>
         <w:t>Uses detector–classifier semantic compatibility checking.</w:t>
       </w:r>
     </w:p>
@@ -3551,10 +4845,15 @@
       <w:pPr>
         <w:pStyle w:val="ListBullet"/>
         <w:rPr>
-          <w:rFonts w:hint="eastAsia"/>
+          <w:sz w:val="20"/>
+          <w:szCs w:val="24"/>
         </w:rPr>
       </w:pPr>
       <w:r>
+        <w:rPr>
+          <w:sz w:val="20"/>
+          <w:szCs w:val="24"/>
+        </w:rPr>
         <w:t>Maintains explicit accepted/rejected accounting.</w:t>
       </w:r>
     </w:p>
@@ -3562,21 +4861,27 @@
       <w:pPr>
         <w:pStyle w:val="ListBullet"/>
         <w:rPr>
-          <w:rFonts w:hint="eastAsia"/>
+          <w:sz w:val="20"/>
+          <w:szCs w:val="24"/>
         </w:rPr>
       </w:pPr>
       <w:r>
+        <w:rPr>
+          <w:sz w:val="20"/>
+          <w:szCs w:val="24"/>
+        </w:rPr>
         <w:t>Includes external Medical Waste 4.0 evaluation.</w:t>
       </w:r>
     </w:p>
     <w:p>
       <w:pPr>
         <w:pStyle w:val="ListBullet"/>
-        <w:rPr>
-          <w:rFonts w:hint="eastAsia"/>
-        </w:rPr>
       </w:pPr>
       <w:r>
+        <w:rPr>
+          <w:sz w:val="20"/>
+          <w:szCs w:val="24"/>
+        </w:rPr>
         <w:t>Provides a deployable API rather than only a notebook experiment.</w:t>
       </w:r>
     </w:p>
@@ -3592,10 +4897,15 @@
       <w:pPr>
         <w:pStyle w:val="ListBullet"/>
         <w:rPr>
-          <w:rFonts w:hint="eastAsia"/>
+          <w:sz w:val="20"/>
+          <w:szCs w:val="24"/>
         </w:rPr>
       </w:pPr>
       <w:r>
+        <w:rPr>
+          <w:sz w:val="20"/>
+          <w:szCs w:val="24"/>
+        </w:rPr>
         <w:t>The current detector benchmark is comparatively weak, with mAP@0.50 of 0.232 on E4 validation.</w:t>
       </w:r>
     </w:p>
@@ -3603,10 +4913,15 @@
       <w:pPr>
         <w:pStyle w:val="ListBullet"/>
         <w:rPr>
-          <w:rFonts w:hint="eastAsia"/>
+          <w:sz w:val="20"/>
+          <w:szCs w:val="24"/>
         </w:rPr>
       </w:pPr>
       <w:r>
+        <w:rPr>
+          <w:sz w:val="20"/>
+          <w:szCs w:val="24"/>
+        </w:rPr>
         <w:t>Classifier metrics and external classification accuracy do not represent end-to-end detection accuracy.</w:t>
       </w:r>
     </w:p>
@@ -3614,10 +4929,15 @@
       <w:pPr>
         <w:pStyle w:val="ListBullet"/>
         <w:rPr>
-          <w:rFonts w:hint="eastAsia"/>
+          <w:sz w:val="20"/>
+          <w:szCs w:val="24"/>
         </w:rPr>
       </w:pPr>
       <w:r>
+        <w:rPr>
+          <w:sz w:val="20"/>
+          <w:szCs w:val="24"/>
+        </w:rPr>
         <w:t>External evaluation is reported only on the supported Medical Waste 4.0 subset.</w:t>
       </w:r>
     </w:p>
@@ -3625,10 +4945,15 @@
       <w:pPr>
         <w:pStyle w:val="ListBullet"/>
         <w:rPr>
-          <w:rFonts w:hint="eastAsia"/>
+          <w:sz w:val="20"/>
+          <w:szCs w:val="24"/>
         </w:rPr>
       </w:pPr>
       <w:r>
+        <w:rPr>
+          <w:sz w:val="20"/>
+          <w:szCs w:val="24"/>
+        </w:rPr>
         <w:t>Mixed-waste scenes, occlusion, lighting variation and unseen waste types can challenge the system.</w:t>
       </w:r>
     </w:p>
@@ -3636,10 +4961,15 @@
       <w:pPr>
         <w:pStyle w:val="ListBullet"/>
         <w:rPr>
-          <w:rFonts w:hint="eastAsia"/>
+          <w:sz w:val="20"/>
+          <w:szCs w:val="24"/>
         </w:rPr>
       </w:pPr>
       <w:r>
+        <w:rPr>
+          <w:sz w:val="20"/>
+          <w:szCs w:val="24"/>
+        </w:rPr>
         <w:t>Disposal guidance depends on the implemented taxonomy and rules.</w:t>
       </w:r>
     </w:p>
@@ -3655,10 +4985,15 @@
       <w:pPr>
         <w:pStyle w:val="ListBullet"/>
         <w:rPr>
-          <w:rFonts w:hint="eastAsia"/>
+          <w:sz w:val="20"/>
+          <w:szCs w:val="24"/>
         </w:rPr>
       </w:pPr>
       <w:r>
+        <w:rPr>
+          <w:sz w:val="20"/>
+          <w:szCs w:val="24"/>
+        </w:rPr>
         <w:t>Improve detector training and annotation coverage.</w:t>
       </w:r>
     </w:p>
@@ -3666,10 +5001,15 @@
       <w:pPr>
         <w:pStyle w:val="ListBullet"/>
         <w:rPr>
-          <w:rFonts w:hint="eastAsia"/>
+          <w:sz w:val="20"/>
+          <w:szCs w:val="24"/>
         </w:rPr>
       </w:pPr>
       <w:r>
+        <w:rPr>
+          <w:sz w:val="20"/>
+          <w:szCs w:val="24"/>
+        </w:rPr>
         <w:t>Expand open-set evaluation with additional unrelated datasets.</w:t>
       </w:r>
     </w:p>
@@ -3677,10 +5017,15 @@
       <w:pPr>
         <w:pStyle w:val="ListBullet"/>
         <w:rPr>
-          <w:rFonts w:hint="eastAsia"/>
+          <w:sz w:val="20"/>
+          <w:szCs w:val="24"/>
         </w:rPr>
       </w:pPr>
       <w:r>
+        <w:rPr>
+          <w:sz w:val="20"/>
+          <w:szCs w:val="24"/>
+        </w:rPr>
         <w:t>Improve calibration under domain shift.</w:t>
       </w:r>
     </w:p>
@@ -3688,10 +5033,15 @@
       <w:pPr>
         <w:pStyle w:val="ListBullet"/>
         <w:rPr>
-          <w:rFonts w:hint="eastAsia"/>
+          <w:sz w:val="20"/>
+          <w:szCs w:val="24"/>
         </w:rPr>
       </w:pPr>
       <w:r>
+        <w:rPr>
+          <w:sz w:val="20"/>
+          <w:szCs w:val="24"/>
+        </w:rPr>
         <w:t>Add video inference and object tracking.</w:t>
       </w:r>
     </w:p>
@@ -3699,10 +5049,15 @@
       <w:pPr>
         <w:pStyle w:val="ListBullet"/>
         <w:rPr>
-          <w:rFonts w:hint="eastAsia"/>
+          <w:sz w:val="20"/>
+          <w:szCs w:val="24"/>
         </w:rPr>
       </w:pPr>
       <w:r>
+        <w:rPr>
+          <w:sz w:val="20"/>
+          <w:szCs w:val="24"/>
+        </w:rPr>
         <w:t>Use active learning for uncertain/rejected samples.</w:t>
       </w:r>
     </w:p>
@@ -3710,10 +5065,15 @@
       <w:pPr>
         <w:pStyle w:val="ListBullet"/>
         <w:rPr>
-          <w:rFonts w:hint="eastAsia"/>
+          <w:sz w:val="20"/>
+          <w:szCs w:val="24"/>
         </w:rPr>
       </w:pPr>
       <w:r>
+        <w:rPr>
+          <w:sz w:val="20"/>
+          <w:szCs w:val="24"/>
+        </w:rPr>
         <w:t>Evaluate latency and resource use on edge hardware.</w:t>
       </w:r>
     </w:p>
@@ -3721,10 +5081,15 @@
       <w:pPr>
         <w:pStyle w:val="ListBullet"/>
         <w:rPr>
-          <w:rFonts w:hint="eastAsia"/>
+          <w:sz w:val="20"/>
+          <w:szCs w:val="24"/>
         </w:rPr>
       </w:pPr>
       <w:r>
+        <w:rPr>
+          <w:sz w:val="20"/>
+          <w:szCs w:val="24"/>
+        </w:rPr>
         <w:t>Expand disposal guidance using regional waste-management rules.</w:t>
       </w:r>
     </w:p>
@@ -3739,26 +5104,49 @@
     <w:p>
       <w:pPr>
         <w:rPr>
-          <w:rFonts w:hint="eastAsia"/>
-        </w:rPr>
-      </w:pPr>
+          <w:sz w:val="20"/>
+          <w:szCs w:val="24"/>
+        </w:rPr>
+      </w:pPr>
+      <w:proofErr w:type="spellStart"/>
       <w:r>
-        <w:t>WasteWise AI demonstrates a complete AI application pipeline for intelligent waste analysis. It integrates YOLO11s detection, Expanded ResNet50 classification, embedding-based OOD rejection, semantic compatibility checking, disposal guidance, external evaluation and API deployment.</w:t>
+        <w:rPr>
+          <w:sz w:val="20"/>
+          <w:szCs w:val="24"/>
+        </w:rPr>
+        <w:t>WasteWise</w:t>
+      </w:r>
+      <w:proofErr w:type="spellEnd"/>
+      <w:r>
+        <w:rPr>
+          <w:sz w:val="20"/>
+          <w:szCs w:val="24"/>
+        </w:rPr>
+        <w:t xml:space="preserve"> AI demonstrates a complete AI application pipeline for intelligent waste analysis. It integrates YOLO11s detection, Expanded ResNet50 classification, embedding-based OOD rejection, semantic compatibility checking, disposal guidance, external evaluation and API deployment.</w:t>
       </w:r>
     </w:p>
     <w:p>
       <w:pPr>
         <w:rPr>
-          <w:rFonts w:hint="eastAsia"/>
+          <w:sz w:val="20"/>
+          <w:szCs w:val="24"/>
         </w:rPr>
       </w:pPr>
       <w:r>
+        <w:rPr>
+          <w:sz w:val="20"/>
+          <w:szCs w:val="24"/>
+        </w:rPr>
         <w:t>The strongest verified result is 99.14% classification accuracy on the supported subset of Medical Waste 4.0. At the same time, the detector evaluation shows why the system should be described honestly as a multi-stage research prototype rather than a uniformly high-accuracy end-to-end detector.</w:t>
       </w:r>
     </w:p>
     <w:p>
       <w:pPr>
         <w:pStyle w:val="Heading1"/>
+        <w:rPr>
+          <w:sz w:val="32"/>
+          <w:szCs w:val="32"/>
+        </w:rPr>
       </w:pPr>
       <w:r>
         <w:t>25. References / Evidence Base</w:t>
@@ -3768,21 +5156,40 @@
       <w:pPr>
         <w:pStyle w:val="ListBullet"/>
         <w:rPr>
-          <w:rFonts w:hint="eastAsia"/>
-        </w:rPr>
-      </w:pPr>
+          <w:sz w:val="20"/>
+          <w:szCs w:val="24"/>
+        </w:rPr>
+      </w:pPr>
+      <w:proofErr w:type="spellStart"/>
       <w:r>
-        <w:t>WasteWise AI project source tree, model checkpoints, scripts, audit outputs and evaluation results.</w:t>
+        <w:rPr>
+          <w:sz w:val="20"/>
+          <w:szCs w:val="24"/>
+        </w:rPr>
+        <w:t>WasteWise</w:t>
+      </w:r>
+      <w:proofErr w:type="spellEnd"/>
+      <w:r>
+        <w:rPr>
+          <w:sz w:val="20"/>
+          <w:szCs w:val="24"/>
+        </w:rPr>
+        <w:t xml:space="preserve"> AI project source tree, model checkpoints, scripts, audit outputs and evaluation results.</w:t>
       </w:r>
     </w:p>
     <w:p>
       <w:pPr>
         <w:pStyle w:val="ListBullet"/>
         <w:rPr>
-          <w:rFonts w:hint="eastAsia"/>
+          <w:sz w:val="20"/>
+          <w:szCs w:val="24"/>
         </w:rPr>
       </w:pPr>
       <w:r>
+        <w:rPr>
+          <w:sz w:val="20"/>
+          <w:szCs w:val="24"/>
+        </w:rPr>
         <w:t>Medical Waste 4.0 integrity, structure, taxonomy mapping and external evaluation outputs.</w:t>
       </w:r>
     </w:p>
@@ -3790,10 +5197,15 @@
       <w:pPr>
         <w:pStyle w:val="ListBullet"/>
         <w:rPr>
-          <w:rFonts w:hint="eastAsia"/>
+          <w:sz w:val="20"/>
+          <w:szCs w:val="24"/>
         </w:rPr>
       </w:pPr>
       <w:r>
+        <w:rPr>
+          <w:sz w:val="20"/>
+          <w:szCs w:val="24"/>
+        </w:rPr>
         <w:t>Controlled preprocessing and training-history/checkpoint metadata.</w:t>
       </w:r>
     </w:p>
@@ -3801,10 +5213,15 @@
       <w:pPr>
         <w:pStyle w:val="ListBullet"/>
         <w:rPr>
-          <w:rFonts w:hint="eastAsia"/>
+          <w:sz w:val="20"/>
+          <w:szCs w:val="24"/>
         </w:rPr>
       </w:pPr>
       <w:r>
+        <w:rPr>
+          <w:sz w:val="20"/>
+          <w:szCs w:val="24"/>
+        </w:rPr>
         <w:t>YOLO detector validation and TACO practical baseline outputs.</w:t>
       </w:r>
     </w:p>
@@ -3812,10 +5229,15 @@
       <w:pPr>
         <w:pStyle w:val="ListBullet"/>
         <w:rPr>
-          <w:rFonts w:hint="eastAsia"/>
+          <w:sz w:val="20"/>
+          <w:szCs w:val="24"/>
         </w:rPr>
       </w:pPr>
       <w:r>
+        <w:rPr>
+          <w:sz w:val="20"/>
+          <w:szCs w:val="24"/>
+        </w:rPr>
         <w:t>OOD calibration and production inference outputs.</w:t>
       </w:r>
     </w:p>
@@ -3823,20 +5245,39 @@
       <w:pPr>
         <w:pStyle w:val="ListBullet"/>
         <w:rPr>
-          <w:rFonts w:hint="eastAsia"/>
-        </w:rPr>
-      </w:pPr>
+          <w:sz w:val="20"/>
+          <w:szCs w:val="24"/>
+        </w:rPr>
+      </w:pPr>
+      <w:proofErr w:type="spellStart"/>
       <w:r>
-        <w:t>FastAPI backend and ResNet50 model implementation.</w:t>
+        <w:rPr>
+          <w:sz w:val="20"/>
+          <w:szCs w:val="24"/>
+        </w:rPr>
+        <w:t>FastAPI</w:t>
+      </w:r>
+      <w:proofErr w:type="spellEnd"/>
+      <w:r>
+        <w:rPr>
+          <w:sz w:val="20"/>
+          <w:szCs w:val="24"/>
+        </w:rPr>
+        <w:t xml:space="preserve"> backend and ResNet50 model implementation.</w:t>
       </w:r>
     </w:p>
     <w:p>
       <w:pPr>
         <w:rPr>
-          <w:rFonts w:hint="eastAsia"/>
+          <w:sz w:val="20"/>
+          <w:szCs w:val="24"/>
         </w:rPr>
       </w:pPr>
       <w:r>
+        <w:rPr>
+          <w:sz w:val="20"/>
+          <w:szCs w:val="24"/>
+        </w:rPr>
         <w:t>Reporting note: historical metric values that could not be traced to a specific accessible project artifact were intentionally excluded. Numerical results in this report are limited to verified project evidence.</w:t>
       </w:r>
     </w:p>
@@ -4663,7 +6104,6 @@
   <w:style w:type="character" w:default="1" w:styleId="DefaultParagraphFont">
     <w:name w:val="Default Paragraph Font"/>
     <w:uiPriority w:val="1"/>
-    <w:semiHidden/>
     <w:unhideWhenUsed/>
   </w:style>
   <w:style w:type="table" w:default="1" w:styleId="TableNormal">

</xml_diff>